<commit_message>
Implemented the referral and environment parts in the officers side then worked on the manager side
</commit_message>
<xml_diff>
--- a/docs/generator/out/HWMS Architecture Document.docx
+++ b/docs/generator/out/HWMS Architecture Document.docx
@@ -231,7 +231,7 @@
                 <w:sz w:val="20"/>
                 <w:szCs w:val="20"/>
               </w:rPr>
-              <w:t xml:space="preserve">Architecture Document</w:t>
+              <w:t xml:space="preserve">Architecture document</w:t>
             </w:r>
           </w:p>
         </w:tc>
@@ -543,7 +543,7 @@
                 <w:sz w:val="20"/>
                 <w:szCs w:val="20"/>
               </w:rPr>
-              <w:t xml:space="preserve">11/08/2026</w:t>
+              <w:t xml:space="preserve">21/08/2026</w:t>
             </w:r>
           </w:p>
         </w:tc>
@@ -621,7 +621,7 @@
                 <w:sz w:val="20"/>
                 <w:szCs w:val="20"/>
               </w:rPr>
-              <w:t xml:space="preserve">002</w:t>
+              <w:t xml:space="preserve">003</w:t>
             </w:r>
           </w:p>
         </w:tc>
@@ -844,7 +844,7 @@
             <w:sz w:val="24"/>
             <w:szCs w:val="24"/>
           </w:rPr>
-          <w:t xml:space="preserve">1.2 Guiding Constraints</w:t>
+          <w:t xml:space="preserve">1.2 Guiding constraints</w:t>
         </w:r>
         <w:r>
           <w:rPr>
@@ -938,7 +938,7 @@
             <w:sz w:val="24"/>
             <w:szCs w:val="24"/>
           </w:rPr>
-          <w:t xml:space="preserve">2 Service Topology</w:t>
+          <w:t xml:space="preserve">2 Service topology</w:t>
         </w:r>
         <w:r>
           <w:rPr>
@@ -1032,7 +1032,7 @@
             <w:sz w:val="24"/>
             <w:szCs w:val="24"/>
           </w:rPr>
-          <w:t xml:space="preserve">2.2 Why Not a Single Application</w:t>
+          <w:t xml:space="preserve">2.2 Why not a single application</w:t>
         </w:r>
         <w:r>
           <w:rPr>
@@ -1054,7 +1054,7 @@
             <w:sz w:val="24"/>
             <w:szCs w:val="24"/>
           </w:rPr>
-          <w:t xml:space="preserve">5</w:t>
+          <w:t xml:space="preserve">6</w:t>
         </w:r>
       </w:hyperlink>
     </w:p>
@@ -1111,7 +1111,7 @@
           <w:tab w:val="right" w:pos="9746" w:leader="dot"/>
         </w:tabs>
         <w:spacing w:after="60" w:line="260" w:lineRule="auto"/>
-        <w:ind w:left="0" w:right="0" w:firstLine="0"/>
+        <w:ind w:left="280" w:right="0" w:firstLine="0"/>
         <w:jc w:val="left"/>
       </w:pPr>
       <w:hyperlink w:history="1" w:anchor="h_9">
@@ -1126,7 +1126,7 @@
             <w:sz w:val="24"/>
             <w:szCs w:val="24"/>
           </w:rPr>
-          <w:t xml:space="preserve">3 Identity and Session</w:t>
+          <w:t xml:space="preserve">2.4 Clinical event boundary</w:t>
         </w:r>
         <w:r>
           <w:rPr>
@@ -1158,7 +1158,7 @@
           <w:tab w:val="right" w:pos="9746" w:leader="dot"/>
         </w:tabs>
         <w:spacing w:after="60" w:line="260" w:lineRule="auto"/>
-        <w:ind w:left="280" w:right="0" w:firstLine="0"/>
+        <w:ind w:left="0" w:right="0" w:firstLine="0"/>
         <w:jc w:val="left"/>
       </w:pPr>
       <w:hyperlink w:history="1" w:anchor="h_10">
@@ -1173,7 +1173,7 @@
             <w:sz w:val="24"/>
             <w:szCs w:val="24"/>
           </w:rPr>
-          <w:t xml:space="preserve">3.1 The Backend for Frontend Pattern</w:t>
+          <w:t xml:space="preserve">3 Identity and session</w:t>
         </w:r>
         <w:r>
           <w:rPr>
@@ -1195,7 +1195,7 @@
             <w:sz w:val="24"/>
             <w:szCs w:val="24"/>
           </w:rPr>
-          <w:t xml:space="preserve">6</w:t>
+          <w:t xml:space="preserve">7</w:t>
         </w:r>
       </w:hyperlink>
     </w:p>
@@ -1209,6 +1209,53 @@
         <w:jc w:val="left"/>
       </w:pPr>
       <w:hyperlink w:history="1" w:anchor="h_11">
+        <w:r>
+          <w:rPr>
+            <w:rFonts w:ascii="Times New Roman" w:cs="Times New Roman" w:eastAsia="Times New Roman" w:hAnsi="Times New Roman"/>
+            <w:b w:val="false"/>
+            <w:bCs w:val="false"/>
+            <w:i w:val="false"/>
+            <w:iCs w:val="false"/>
+            <w:color w:val="000000"/>
+            <w:sz w:val="24"/>
+            <w:szCs w:val="24"/>
+          </w:rPr>
+          <w:t xml:space="preserve">3.1 The backend for frontend pattern</w:t>
+        </w:r>
+        <w:r>
+          <w:rPr>
+            <w:rFonts w:ascii="Times New Roman" w:cs="Times New Roman" w:eastAsia="Times New Roman" w:hAnsi="Times New Roman"/>
+            <w:color w:val="000000"/>
+            <w:sz w:val="24"/>
+            <w:szCs w:val="24"/>
+          </w:rPr>
+          <w:tab/>
+        </w:r>
+        <w:r>
+          <w:rPr>
+            <w:rFonts w:ascii="Times New Roman" w:cs="Times New Roman" w:eastAsia="Times New Roman" w:hAnsi="Times New Roman"/>
+            <w:b w:val="false"/>
+            <w:bCs w:val="false"/>
+            <w:i w:val="false"/>
+            <w:iCs w:val="false"/>
+            <w:color w:val="000000"/>
+            <w:sz w:val="24"/>
+            <w:szCs w:val="24"/>
+          </w:rPr>
+          <w:t xml:space="preserve">7</w:t>
+        </w:r>
+      </w:hyperlink>
+    </w:p>
+    <w:p>
+      <w:pPr>
+        <w:tabs>
+          <w:tab w:val="right" w:pos="9746" w:leader="dot"/>
+        </w:tabs>
+        <w:spacing w:after="60" w:line="260" w:lineRule="auto"/>
+        <w:ind w:left="280" w:right="0" w:firstLine="0"/>
+        <w:jc w:val="left"/>
+      </w:pPr>
+      <w:hyperlink w:history="1" w:anchor="h_12">
         <w:r>
           <w:rPr>
             <w:rFonts w:ascii="Times New Roman" w:cs="Times New Roman" w:eastAsia="Times New Roman" w:hAnsi="Times New Roman"/>
@@ -1242,7 +1289,7 @@
             <w:sz w:val="24"/>
             <w:szCs w:val="24"/>
           </w:rPr>
-          <w:t xml:space="preserve">6</w:t>
+          <w:t xml:space="preserve">7</w:t>
         </w:r>
       </w:hyperlink>
     </w:p>
@@ -1255,7 +1302,7 @@
         <w:ind w:left="280" w:right="0" w:firstLine="0"/>
         <w:jc w:val="left"/>
       </w:pPr>
-      <w:hyperlink w:history="1" w:anchor="h_12">
+      <w:hyperlink w:history="1" w:anchor="h_13">
         <w:r>
           <w:rPr>
             <w:rFonts w:ascii="Times New Roman" w:cs="Times New Roman" w:eastAsia="Times New Roman" w:hAnsi="Times New Roman"/>
@@ -1267,7 +1314,7 @@
             <w:sz w:val="24"/>
             <w:szCs w:val="24"/>
           </w:rPr>
-          <w:t xml:space="preserve">3.3 Account Administration</w:t>
+          <w:t xml:space="preserve">3.3 Account administration</w:t>
         </w:r>
         <w:r>
           <w:rPr>
@@ -1299,10 +1346,57 @@
           <w:tab w:val="right" w:pos="9746" w:leader="dot"/>
         </w:tabs>
         <w:spacing w:after="60" w:line="260" w:lineRule="auto"/>
+        <w:ind w:left="280" w:right="0" w:firstLine="0"/>
+        <w:jc w:val="left"/>
+      </w:pPr>
+      <w:hyperlink w:history="1" w:anchor="h_14">
+        <w:r>
+          <w:rPr>
+            <w:rFonts w:ascii="Times New Roman" w:cs="Times New Roman" w:eastAsia="Times New Roman" w:hAnsi="Times New Roman"/>
+            <w:b w:val="false"/>
+            <w:bCs w:val="false"/>
+            <w:i w:val="false"/>
+            <w:iCs w:val="false"/>
+            <w:color w:val="000000"/>
+            <w:sz w:val="24"/>
+            <w:szCs w:val="24"/>
+          </w:rPr>
+          <w:t xml:space="preserve">3.4 Branding at sign-in and after sign-in</w:t>
+        </w:r>
+        <w:r>
+          <w:rPr>
+            <w:rFonts w:ascii="Times New Roman" w:cs="Times New Roman" w:eastAsia="Times New Roman" w:hAnsi="Times New Roman"/>
+            <w:color w:val="000000"/>
+            <w:sz w:val="24"/>
+            <w:szCs w:val="24"/>
+          </w:rPr>
+          <w:tab/>
+        </w:r>
+        <w:r>
+          <w:rPr>
+            <w:rFonts w:ascii="Times New Roman" w:cs="Times New Roman" w:eastAsia="Times New Roman" w:hAnsi="Times New Roman"/>
+            <w:b w:val="false"/>
+            <w:bCs w:val="false"/>
+            <w:i w:val="false"/>
+            <w:iCs w:val="false"/>
+            <w:color w:val="000000"/>
+            <w:sz w:val="24"/>
+            <w:szCs w:val="24"/>
+          </w:rPr>
+          <w:t xml:space="preserve">7</w:t>
+        </w:r>
+      </w:hyperlink>
+    </w:p>
+    <w:p>
+      <w:pPr>
+        <w:tabs>
+          <w:tab w:val="right" w:pos="9746" w:leader="dot"/>
+        </w:tabs>
+        <w:spacing w:after="60" w:line="260" w:lineRule="auto"/>
         <w:ind w:left="0" w:right="0" w:firstLine="0"/>
         <w:jc w:val="left"/>
       </w:pPr>
-      <w:hyperlink w:history="1" w:anchor="h_13">
+      <w:hyperlink w:history="1" w:anchor="h_15">
         <w:r>
           <w:rPr>
             <w:rFonts w:ascii="Times New Roman" w:cs="Times New Roman" w:eastAsia="Times New Roman" w:hAnsi="Times New Roman"/>
@@ -1336,7 +1430,7 @@
             <w:sz w:val="24"/>
             <w:szCs w:val="24"/>
           </w:rPr>
-          <w:t xml:space="preserve">7</w:t>
+          <w:t xml:space="preserve">8</w:t>
         </w:r>
       </w:hyperlink>
     </w:p>
@@ -1349,7 +1443,7 @@
         <w:ind w:left="280" w:right="0" w:firstLine="0"/>
         <w:jc w:val="left"/>
       </w:pPr>
-      <w:hyperlink w:history="1" w:anchor="h_14">
+      <w:hyperlink w:history="1" w:anchor="h_16">
         <w:r>
           <w:rPr>
             <w:rFonts w:ascii="Times New Roman" w:cs="Times New Roman" w:eastAsia="Times New Roman" w:hAnsi="Times New Roman"/>
@@ -1361,7 +1455,7 @@
             <w:sz w:val="24"/>
             <w:szCs w:val="24"/>
           </w:rPr>
-          <w:t xml:space="preserve">4.1 Ownership Rules</w:t>
+          <w:t xml:space="preserve">4.1 Ownership rules</w:t>
         </w:r>
         <w:r>
           <w:rPr>
@@ -1383,7 +1477,7 @@
             <w:sz w:val="24"/>
             <w:szCs w:val="24"/>
           </w:rPr>
-          <w:t xml:space="preserve">7</w:t>
+          <w:t xml:space="preserve">8</w:t>
         </w:r>
       </w:hyperlink>
     </w:p>
@@ -1396,7 +1490,7 @@
         <w:ind w:left="280" w:right="0" w:firstLine="0"/>
         <w:jc w:val="left"/>
       </w:pPr>
-      <w:hyperlink w:history="1" w:anchor="h_15">
+      <w:hyperlink w:history="1" w:anchor="h_17">
         <w:r>
           <w:rPr>
             <w:rFonts w:ascii="Times New Roman" w:cs="Times New Roman" w:eastAsia="Times New Roman" w:hAnsi="Times New Roman"/>
@@ -1408,7 +1502,7 @@
             <w:sz w:val="24"/>
             <w:szCs w:val="24"/>
           </w:rPr>
-          <w:t xml:space="preserve">4.2 The Clinical Schema</w:t>
+          <w:t xml:space="preserve">4.2 The clinical schema</w:t>
         </w:r>
         <w:r>
           <w:rPr>
@@ -1430,7 +1524,7 @@
             <w:sz w:val="24"/>
             <w:szCs w:val="24"/>
           </w:rPr>
-          <w:t xml:space="preserve">7</w:t>
+          <w:t xml:space="preserve">8</w:t>
         </w:r>
       </w:hyperlink>
     </w:p>
@@ -1443,7 +1537,7 @@
         <w:ind w:left="280" w:right="0" w:firstLine="0"/>
         <w:jc w:val="left"/>
       </w:pPr>
-      <w:hyperlink w:history="1" w:anchor="h_16">
+      <w:hyperlink w:history="1" w:anchor="h_18">
         <w:r>
           <w:rPr>
             <w:rFonts w:ascii="Times New Roman" w:cs="Times New Roman" w:eastAsia="Times New Roman" w:hAnsi="Times New Roman"/>
@@ -1455,7 +1549,7 @@
             <w:sz w:val="24"/>
             <w:szCs w:val="24"/>
           </w:rPr>
-          <w:t xml:space="preserve">4.3 Snapshots on Forms</w:t>
+          <w:t xml:space="preserve">4.3 Snapshots on forms</w:t>
         </w:r>
         <w:r>
           <w:rPr>
@@ -1477,7 +1571,54 @@
             <w:sz w:val="24"/>
             <w:szCs w:val="24"/>
           </w:rPr>
-          <w:t xml:space="preserve">7</w:t>
+          <w:t xml:space="preserve">8</w:t>
+        </w:r>
+      </w:hyperlink>
+    </w:p>
+    <w:p>
+      <w:pPr>
+        <w:tabs>
+          <w:tab w:val="right" w:pos="9746" w:leader="dot"/>
+        </w:tabs>
+        <w:spacing w:after="60" w:line="260" w:lineRule="auto"/>
+        <w:ind w:left="280" w:right="0" w:firstLine="0"/>
+        <w:jc w:val="left"/>
+      </w:pPr>
+      <w:hyperlink w:history="1" w:anchor="h_19">
+        <w:r>
+          <w:rPr>
+            <w:rFonts w:ascii="Times New Roman" w:cs="Times New Roman" w:eastAsia="Times New Roman" w:hAnsi="Times New Roman"/>
+            <w:b w:val="false"/>
+            <w:bCs w:val="false"/>
+            <w:i w:val="false"/>
+            <w:iCs w:val="false"/>
+            <w:color w:val="000000"/>
+            <w:sz w:val="24"/>
+            <w:szCs w:val="24"/>
+          </w:rPr>
+          <w:t xml:space="preserve">4.4 Effective-dated reference data and frozen evaluations</w:t>
+        </w:r>
+        <w:r>
+          <w:rPr>
+            <w:rFonts w:ascii="Times New Roman" w:cs="Times New Roman" w:eastAsia="Times New Roman" w:hAnsi="Times New Roman"/>
+            <w:color w:val="000000"/>
+            <w:sz w:val="24"/>
+            <w:szCs w:val="24"/>
+          </w:rPr>
+          <w:tab/>
+        </w:r>
+        <w:r>
+          <w:rPr>
+            <w:rFonts w:ascii="Times New Roman" w:cs="Times New Roman" w:eastAsia="Times New Roman" w:hAnsi="Times New Roman"/>
+            <w:b w:val="false"/>
+            <w:bCs w:val="false"/>
+            <w:i w:val="false"/>
+            <w:iCs w:val="false"/>
+            <w:color w:val="000000"/>
+            <w:sz w:val="24"/>
+            <w:szCs w:val="24"/>
+          </w:rPr>
+          <w:t xml:space="preserve">9</w:t>
         </w:r>
       </w:hyperlink>
     </w:p>
@@ -1490,7 +1631,7 @@
         <w:ind w:left="0" w:right="0" w:firstLine="0"/>
         <w:jc w:val="left"/>
       </w:pPr>
-      <w:hyperlink w:history="1" w:anchor="h_17">
+      <w:hyperlink w:history="1" w:anchor="h_20">
         <w:r>
           <w:rPr>
             <w:rFonts w:ascii="Times New Roman" w:cs="Times New Roman" w:eastAsia="Times New Roman" w:hAnsi="Times New Roman"/>
@@ -1524,7 +1665,7 @@
             <w:sz w:val="24"/>
             <w:szCs w:val="24"/>
           </w:rPr>
-          <w:t xml:space="preserve">8</w:t>
+          <w:t xml:space="preserve">9</w:t>
         </w:r>
       </w:hyperlink>
     </w:p>
@@ -1537,7 +1678,7 @@
         <w:ind w:left="280" w:right="0" w:firstLine="0"/>
         <w:jc w:val="left"/>
       </w:pPr>
-      <w:hyperlink w:history="1" w:anchor="h_18">
+      <w:hyperlink w:history="1" w:anchor="h_21">
         <w:r>
           <w:rPr>
             <w:rFonts w:ascii="Times New Roman" w:cs="Times New Roman" w:eastAsia="Times New Roman" w:hAnsi="Times New Roman"/>
@@ -1571,7 +1712,7 @@
             <w:sz w:val="24"/>
             <w:szCs w:val="24"/>
           </w:rPr>
-          <w:t xml:space="preserve">8</w:t>
+          <w:t xml:space="preserve">9</w:t>
         </w:r>
       </w:hyperlink>
     </w:p>
@@ -1584,7 +1725,7 @@
         <w:ind w:left="280" w:right="0" w:firstLine="0"/>
         <w:jc w:val="left"/>
       </w:pPr>
-      <w:hyperlink w:history="1" w:anchor="h_19">
+      <w:hyperlink w:history="1" w:anchor="h_22">
         <w:r>
           <w:rPr>
             <w:rFonts w:ascii="Times New Roman" w:cs="Times New Roman" w:eastAsia="Times New Roman" w:hAnsi="Times New Roman"/>
@@ -1618,7 +1759,7 @@
             <w:sz w:val="24"/>
             <w:szCs w:val="24"/>
           </w:rPr>
-          <w:t xml:space="preserve">8</w:t>
+          <w:t xml:space="preserve">9</w:t>
         </w:r>
       </w:hyperlink>
     </w:p>
@@ -1631,7 +1772,7 @@
         <w:ind w:left="280" w:right="0" w:firstLine="0"/>
         <w:jc w:val="left"/>
       </w:pPr>
-      <w:hyperlink w:history="1" w:anchor="h_20">
+      <w:hyperlink w:history="1" w:anchor="h_23">
         <w:r>
           <w:rPr>
             <w:rFonts w:ascii="Times New Roman" w:cs="Times New Roman" w:eastAsia="Times New Roman" w:hAnsi="Times New Roman"/>
@@ -1665,7 +1806,7 @@
             <w:sz w:val="24"/>
             <w:szCs w:val="24"/>
           </w:rPr>
-          <w:t xml:space="preserve">8</w:t>
+          <w:t xml:space="preserve">10</w:t>
         </w:r>
       </w:hyperlink>
     </w:p>
@@ -1678,7 +1819,7 @@
         <w:ind w:left="0" w:right="0" w:firstLine="0"/>
         <w:jc w:val="left"/>
       </w:pPr>
-      <w:hyperlink w:history="1" w:anchor="h_21">
+      <w:hyperlink w:history="1" w:anchor="h_24">
         <w:r>
           <w:rPr>
             <w:rFonts w:ascii="Times New Roman" w:cs="Times New Roman" w:eastAsia="Times New Roman" w:hAnsi="Times New Roman"/>
@@ -1712,7 +1853,7 @@
             <w:sz w:val="24"/>
             <w:szCs w:val="24"/>
           </w:rPr>
-          <w:t xml:space="preserve">9</w:t>
+          <w:t xml:space="preserve">10</w:t>
         </w:r>
       </w:hyperlink>
     </w:p>
@@ -1725,7 +1866,7 @@
         <w:ind w:left="280" w:right="0" w:firstLine="0"/>
         <w:jc w:val="left"/>
       </w:pPr>
-      <w:hyperlink w:history="1" w:anchor="h_22">
+      <w:hyperlink w:history="1" w:anchor="h_25">
         <w:r>
           <w:rPr>
             <w:rFonts w:ascii="Times New Roman" w:cs="Times New Roman" w:eastAsia="Times New Roman" w:hAnsi="Times New Roman"/>
@@ -1737,7 +1878,7 @@
             <w:sz w:val="24"/>
             <w:szCs w:val="24"/>
           </w:rPr>
-          <w:t xml:space="preserve">6.1 Known Limitations</w:t>
+          <w:t xml:space="preserve">6.1 Known limitations</w:t>
         </w:r>
         <w:r>
           <w:rPr>
@@ -1759,7 +1900,7 @@
             <w:sz w:val="24"/>
             <w:szCs w:val="24"/>
           </w:rPr>
-          <w:t xml:space="preserve">9</w:t>
+          <w:t xml:space="preserve">11</w:t>
         </w:r>
       </w:hyperlink>
     </w:p>
@@ -1772,7 +1913,7 @@
         <w:ind w:left="0" w:right="0" w:firstLine="0"/>
         <w:jc w:val="left"/>
       </w:pPr>
-      <w:hyperlink w:history="1" w:anchor="h_23">
+      <w:hyperlink w:history="1" w:anchor="h_26">
         <w:r>
           <w:rPr>
             <w:rFonts w:ascii="Times New Roman" w:cs="Times New Roman" w:eastAsia="Times New Roman" w:hAnsi="Times New Roman"/>
@@ -1806,7 +1947,7 @@
             <w:sz w:val="24"/>
             <w:szCs w:val="24"/>
           </w:rPr>
-          <w:t xml:space="preserve">9</w:t>
+          <w:t xml:space="preserve">11</w:t>
         </w:r>
       </w:hyperlink>
     </w:p>
@@ -1855,7 +1996,7 @@
             <w:sz w:val="24"/>
             <w:szCs w:val="24"/>
           </w:rPr>
-          <w:t xml:space="preserve">Figure 2.1: Service Topology and Request Path</w:t>
+          <w:t xml:space="preserve">Figure 2.1: Service topology and request path</w:t>
         </w:r>
         <w:r>
           <w:rPr>
@@ -1924,7 +2065,7 @@
             <w:sz w:val="24"/>
             <w:szCs w:val="24"/>
           </w:rPr>
-          <w:t xml:space="preserve">8</w:t>
+          <w:t xml:space="preserve">9</w:t>
         </w:r>
       </w:hyperlink>
     </w:p>
@@ -1983,7 +2124,7 @@
             <w:sz w:val="24"/>
             <w:szCs w:val="24"/>
           </w:rPr>
-          <w:t xml:space="preserve">Table 1.1: Technology Choices and Their Reasons</w:t>
+          <w:t xml:space="preserve">Table 1.1: Technology choices and their reasons</w:t>
         </w:r>
         <w:r>
           <w:rPr>
@@ -2030,7 +2171,7 @@
             <w:sz w:val="24"/>
             <w:szCs w:val="24"/>
           </w:rPr>
-          <w:t xml:space="preserve">Table 2.1: Services and What Each Owns</w:t>
+          <w:t xml:space="preserve">Table 2.1: Six application services and what each owns</w:t>
         </w:r>
         <w:r>
           <w:rPr>
@@ -2077,54 +2218,7 @@
             <w:sz w:val="24"/>
             <w:szCs w:val="24"/>
           </w:rPr>
-          <w:t xml:space="preserve">Table 3.1: Roles as Held in the Identity Provider</w:t>
-        </w:r>
-        <w:r>
-          <w:rPr>
-            <w:rFonts w:ascii="Times New Roman" w:cs="Times New Roman" w:eastAsia="Times New Roman" w:hAnsi="Times New Roman"/>
-            <w:color w:val="000000"/>
-            <w:sz w:val="24"/>
-            <w:szCs w:val="24"/>
-          </w:rPr>
-          <w:tab/>
-        </w:r>
-        <w:r>
-          <w:rPr>
-            <w:rFonts w:ascii="Times New Roman" w:cs="Times New Roman" w:eastAsia="Times New Roman" w:hAnsi="Times New Roman"/>
-            <w:b w:val="false"/>
-            <w:bCs w:val="false"/>
-            <w:i w:val="false"/>
-            <w:iCs w:val="false"/>
-            <w:color w:val="000000"/>
-            <w:sz w:val="24"/>
-            <w:szCs w:val="24"/>
-          </w:rPr>
-          <w:t xml:space="preserve">6</w:t>
-        </w:r>
-      </w:hyperlink>
-    </w:p>
-    <w:p>
-      <w:pPr>
-        <w:tabs>
-          <w:tab w:val="right" w:pos="9746" w:leader="dot"/>
-        </w:tabs>
-        <w:spacing w:after="60" w:line="260" w:lineRule="auto"/>
-        <w:ind w:left="0" w:right="0" w:firstLine="0"/>
-        <w:jc w:val="left"/>
-      </w:pPr>
-      <w:hyperlink w:history="1" w:anchor="tbl_4_1">
-        <w:r>
-          <w:rPr>
-            <w:rFonts w:ascii="Times New Roman" w:cs="Times New Roman" w:eastAsia="Times New Roman" w:hAnsi="Times New Roman"/>
-            <w:b w:val="false"/>
-            <w:bCs w:val="false"/>
-            <w:i w:val="false"/>
-            <w:iCs w:val="false"/>
-            <w:color w:val="000000"/>
-            <w:sz w:val="24"/>
-            <w:szCs w:val="24"/>
-          </w:rPr>
-          <w:t xml:space="preserve">Table 4.1: Data Ownership Rules</w:t>
+          <w:t xml:space="preserve">Table 3.1: Roles as held in the identity provider</w:t>
         </w:r>
         <w:r>
           <w:rPr>
@@ -2159,7 +2253,7 @@
         <w:ind w:left="0" w:right="0" w:firstLine="0"/>
         <w:jc w:val="left"/>
       </w:pPr>
-      <w:hyperlink w:history="1" w:anchor="tbl_5_1">
+      <w:hyperlink w:history="1" w:anchor="tbl_4_1">
         <w:r>
           <w:rPr>
             <w:rFonts w:ascii="Times New Roman" w:cs="Times New Roman" w:eastAsia="Times New Roman" w:hAnsi="Times New Roman"/>
@@ -2171,7 +2265,7 @@
             <w:sz w:val="24"/>
             <w:szCs w:val="24"/>
           </w:rPr>
-          <w:t xml:space="preserve">Table 5.1: Deployment Constraints for Production</w:t>
+          <w:t xml:space="preserve">Table 4.1: Data ownership rules</w:t>
         </w:r>
         <w:r>
           <w:rPr>
@@ -2206,7 +2300,7 @@
         <w:ind w:left="0" w:right="0" w:firstLine="0"/>
         <w:jc w:val="left"/>
       </w:pPr>
-      <w:hyperlink w:history="1" w:anchor="tbl_6_1">
+      <w:hyperlink w:history="1" w:anchor="tbl_5_1">
         <w:r>
           <w:rPr>
             <w:rFonts w:ascii="Times New Roman" w:cs="Times New Roman" w:eastAsia="Times New Roman" w:hAnsi="Times New Roman"/>
@@ -2218,7 +2312,7 @@
             <w:sz w:val="24"/>
             <w:szCs w:val="24"/>
           </w:rPr>
-          <w:t xml:space="preserve">Table 6.1: Measures That Keep the Topology Maintainable</w:t>
+          <w:t xml:space="preserve">Table 5.1: Deployment constraints for production</w:t>
         </w:r>
         <w:r>
           <w:rPr>
@@ -2253,7 +2347,7 @@
         <w:ind w:left="0" w:right="0" w:firstLine="0"/>
         <w:jc w:val="left"/>
       </w:pPr>
-      <w:hyperlink w:history="1" w:anchor="tbl_6_2">
+      <w:hyperlink w:history="1" w:anchor="tbl_6_1">
         <w:r>
           <w:rPr>
             <w:rFonts w:ascii="Times New Roman" w:cs="Times New Roman" w:eastAsia="Times New Roman" w:hAnsi="Times New Roman"/>
@@ -2265,101 +2359,7 @@
             <w:sz w:val="24"/>
             <w:szCs w:val="24"/>
           </w:rPr>
-          <w:t xml:space="preserve">Table 6.2: Known Limitations and Their Consequences</w:t>
-        </w:r>
-        <w:r>
-          <w:rPr>
-            <w:rFonts w:ascii="Times New Roman" w:cs="Times New Roman" w:eastAsia="Times New Roman" w:hAnsi="Times New Roman"/>
-            <w:color w:val="000000"/>
-            <w:sz w:val="24"/>
-            <w:szCs w:val="24"/>
-          </w:rPr>
-          <w:tab/>
-        </w:r>
-        <w:r>
-          <w:rPr>
-            <w:rFonts w:ascii="Times New Roman" w:cs="Times New Roman" w:eastAsia="Times New Roman" w:hAnsi="Times New Roman"/>
-            <w:b w:val="false"/>
-            <w:bCs w:val="false"/>
-            <w:i w:val="false"/>
-            <w:iCs w:val="false"/>
-            <w:color w:val="000000"/>
-            <w:sz w:val="24"/>
-            <w:szCs w:val="24"/>
-          </w:rPr>
-          <w:t xml:space="preserve">9</w:t>
-        </w:r>
-      </w:hyperlink>
-    </w:p>
-    <w:p>
-      <w:pPr>
-        <w:tabs>
-          <w:tab w:val="right" w:pos="9746" w:leader="dot"/>
-        </w:tabs>
-        <w:spacing w:after="60" w:line="260" w:lineRule="auto"/>
-        <w:ind w:left="0" w:right="0" w:firstLine="0"/>
-        <w:jc w:val="left"/>
-      </w:pPr>
-      <w:hyperlink w:history="1" w:anchor="tbl_7_1">
-        <w:r>
-          <w:rPr>
-            <w:rFonts w:ascii="Times New Roman" w:cs="Times New Roman" w:eastAsia="Times New Roman" w:hAnsi="Times New Roman"/>
-            <w:b w:val="false"/>
-            <w:bCs w:val="false"/>
-            <w:i w:val="false"/>
-            <w:iCs w:val="false"/>
-            <w:color w:val="000000"/>
-            <w:sz w:val="24"/>
-            <w:szCs w:val="24"/>
-          </w:rPr>
-          <w:t xml:space="preserve">Table 7.1: Position at Handover</w:t>
-        </w:r>
-        <w:r>
-          <w:rPr>
-            <w:rFonts w:ascii="Times New Roman" w:cs="Times New Roman" w:eastAsia="Times New Roman" w:hAnsi="Times New Roman"/>
-            <w:color w:val="000000"/>
-            <w:sz w:val="24"/>
-            <w:szCs w:val="24"/>
-          </w:rPr>
-          <w:tab/>
-        </w:r>
-        <w:r>
-          <w:rPr>
-            <w:rFonts w:ascii="Times New Roman" w:cs="Times New Roman" w:eastAsia="Times New Roman" w:hAnsi="Times New Roman"/>
-            <w:b w:val="false"/>
-            <w:bCs w:val="false"/>
-            <w:i w:val="false"/>
-            <w:iCs w:val="false"/>
-            <w:color w:val="000000"/>
-            <w:sz w:val="24"/>
-            <w:szCs w:val="24"/>
-          </w:rPr>
-          <w:t xml:space="preserve">9</w:t>
-        </w:r>
-      </w:hyperlink>
-    </w:p>
-    <w:p>
-      <w:pPr>
-        <w:tabs>
-          <w:tab w:val="right" w:pos="9746" w:leader="dot"/>
-        </w:tabs>
-        <w:spacing w:after="60" w:line="260" w:lineRule="auto"/>
-        <w:ind w:left="0" w:right="0" w:firstLine="0"/>
-        <w:jc w:val="left"/>
-      </w:pPr>
-      <w:hyperlink w:history="1" w:anchor="tbl_7_2">
-        <w:r>
-          <w:rPr>
-            <w:rFonts w:ascii="Times New Roman" w:cs="Times New Roman" w:eastAsia="Times New Roman" w:hAnsi="Times New Roman"/>
-            <w:b w:val="false"/>
-            <w:bCs w:val="false"/>
-            <w:i w:val="false"/>
-            <w:iCs w:val="false"/>
-            <w:color w:val="000000"/>
-            <w:sz w:val="24"/>
-            <w:szCs w:val="24"/>
-          </w:rPr>
-          <w:t xml:space="preserve">Table 7.2: Architecture Document Sign Off</w:t>
+          <w:t xml:space="preserve">Table 6.1: Measures that keep the topology maintainable</w:t>
         </w:r>
         <w:r>
           <w:rPr>
@@ -2386,6 +2386,147 @@
       </w:hyperlink>
     </w:p>
     <w:p>
+      <w:pPr>
+        <w:tabs>
+          <w:tab w:val="right" w:pos="9746" w:leader="dot"/>
+        </w:tabs>
+        <w:spacing w:after="60" w:line="260" w:lineRule="auto"/>
+        <w:ind w:left="0" w:right="0" w:firstLine="0"/>
+        <w:jc w:val="left"/>
+      </w:pPr>
+      <w:hyperlink w:history="1" w:anchor="tbl_6_2">
+        <w:r>
+          <w:rPr>
+            <w:rFonts w:ascii="Times New Roman" w:cs="Times New Roman" w:eastAsia="Times New Roman" w:hAnsi="Times New Roman"/>
+            <w:b w:val="false"/>
+            <w:bCs w:val="false"/>
+            <w:i w:val="false"/>
+            <w:iCs w:val="false"/>
+            <w:color w:val="000000"/>
+            <w:sz w:val="24"/>
+            <w:szCs w:val="24"/>
+          </w:rPr>
+          <w:t xml:space="preserve">Table 6.2: Known limitations and their consequences</w:t>
+        </w:r>
+        <w:r>
+          <w:rPr>
+            <w:rFonts w:ascii="Times New Roman" w:cs="Times New Roman" w:eastAsia="Times New Roman" w:hAnsi="Times New Roman"/>
+            <w:color w:val="000000"/>
+            <w:sz w:val="24"/>
+            <w:szCs w:val="24"/>
+          </w:rPr>
+          <w:tab/>
+        </w:r>
+        <w:r>
+          <w:rPr>
+            <w:rFonts w:ascii="Times New Roman" w:cs="Times New Roman" w:eastAsia="Times New Roman" w:hAnsi="Times New Roman"/>
+            <w:b w:val="false"/>
+            <w:bCs w:val="false"/>
+            <w:i w:val="false"/>
+            <w:iCs w:val="false"/>
+            <w:color w:val="000000"/>
+            <w:sz w:val="24"/>
+            <w:szCs w:val="24"/>
+          </w:rPr>
+          <w:t xml:space="preserve">11</w:t>
+        </w:r>
+      </w:hyperlink>
+    </w:p>
+    <w:p>
+      <w:pPr>
+        <w:tabs>
+          <w:tab w:val="right" w:pos="9746" w:leader="dot"/>
+        </w:tabs>
+        <w:spacing w:after="60" w:line="260" w:lineRule="auto"/>
+        <w:ind w:left="0" w:right="0" w:firstLine="0"/>
+        <w:jc w:val="left"/>
+      </w:pPr>
+      <w:hyperlink w:history="1" w:anchor="tbl_7_1">
+        <w:r>
+          <w:rPr>
+            <w:rFonts w:ascii="Times New Roman" w:cs="Times New Roman" w:eastAsia="Times New Roman" w:hAnsi="Times New Roman"/>
+            <w:b w:val="false"/>
+            <w:bCs w:val="false"/>
+            <w:i w:val="false"/>
+            <w:iCs w:val="false"/>
+            <w:color w:val="000000"/>
+            <w:sz w:val="24"/>
+            <w:szCs w:val="24"/>
+          </w:rPr>
+          <w:t xml:space="preserve">Table 7.1: Position at handover</w:t>
+        </w:r>
+        <w:r>
+          <w:rPr>
+            <w:rFonts w:ascii="Times New Roman" w:cs="Times New Roman" w:eastAsia="Times New Roman" w:hAnsi="Times New Roman"/>
+            <w:color w:val="000000"/>
+            <w:sz w:val="24"/>
+            <w:szCs w:val="24"/>
+          </w:rPr>
+          <w:tab/>
+        </w:r>
+        <w:r>
+          <w:rPr>
+            <w:rFonts w:ascii="Times New Roman" w:cs="Times New Roman" w:eastAsia="Times New Roman" w:hAnsi="Times New Roman"/>
+            <w:b w:val="false"/>
+            <w:bCs w:val="false"/>
+            <w:i w:val="false"/>
+            <w:iCs w:val="false"/>
+            <w:color w:val="000000"/>
+            <w:sz w:val="24"/>
+            <w:szCs w:val="24"/>
+          </w:rPr>
+          <w:t xml:space="preserve">11</w:t>
+        </w:r>
+      </w:hyperlink>
+    </w:p>
+    <w:p>
+      <w:pPr>
+        <w:tabs>
+          <w:tab w:val="right" w:pos="9746" w:leader="dot"/>
+        </w:tabs>
+        <w:spacing w:after="60" w:line="260" w:lineRule="auto"/>
+        <w:ind w:left="0" w:right="0" w:firstLine="0"/>
+        <w:jc w:val="left"/>
+      </w:pPr>
+      <w:hyperlink w:history="1" w:anchor="tbl_7_2">
+        <w:r>
+          <w:rPr>
+            <w:rFonts w:ascii="Times New Roman" w:cs="Times New Roman" w:eastAsia="Times New Roman" w:hAnsi="Times New Roman"/>
+            <w:b w:val="false"/>
+            <w:bCs w:val="false"/>
+            <w:i w:val="false"/>
+            <w:iCs w:val="false"/>
+            <w:color w:val="000000"/>
+            <w:sz w:val="24"/>
+            <w:szCs w:val="24"/>
+          </w:rPr>
+          <w:t xml:space="preserve">Table 7.2: Architecture document sign-off</w:t>
+        </w:r>
+        <w:r>
+          <w:rPr>
+            <w:rFonts w:ascii="Times New Roman" w:cs="Times New Roman" w:eastAsia="Times New Roman" w:hAnsi="Times New Roman"/>
+            <w:color w:val="000000"/>
+            <w:sz w:val="24"/>
+            <w:szCs w:val="24"/>
+          </w:rPr>
+          <w:tab/>
+        </w:r>
+        <w:r>
+          <w:rPr>
+            <w:rFonts w:ascii="Times New Roman" w:cs="Times New Roman" w:eastAsia="Times New Roman" w:hAnsi="Times New Roman"/>
+            <w:b w:val="false"/>
+            <w:bCs w:val="false"/>
+            <w:i w:val="false"/>
+            <w:iCs w:val="false"/>
+            <w:color w:val="000000"/>
+            <w:sz w:val="24"/>
+            <w:szCs w:val="24"/>
+          </w:rPr>
+          <w:t xml:space="preserve">12</w:t>
+        </w:r>
+      </w:hyperlink>
+    </w:p>
+    <w:p>
       <w:r>
         <w:br w:type="page"/>
       </w:r>
@@ -2401,7 +2542,7 @@
         <w:ind w:left="0" w:right="0" w:firstLine="0"/>
         <w:jc w:val="left"/>
       </w:pPr>
-      <w:bookmarkStart w:name="h_1" w:id="100"/>
+      <w:bookmarkStart w:name="h_1" w:id="1"/>
       <w:r>
         <w:rPr>
           <w:rFonts w:ascii="Times New Roman" w:cs="Times New Roman" w:eastAsia="Times New Roman" w:hAnsi="Times New Roman"/>
@@ -2415,7 +2556,7 @@
         </w:rPr>
         <w:t xml:space="preserve">Introduction</w:t>
       </w:r>
-      <w:bookmarkEnd w:id="100"/>
+      <w:bookmarkEnd w:id="1"/>
     </w:p>
     <w:p>
       <w:pPr>
@@ -2428,7 +2569,7 @@
         <w:ind w:left="0" w:right="0" w:firstLine="0"/>
         <w:jc w:val="left"/>
       </w:pPr>
-      <w:bookmarkStart w:name="h_2" w:id="101"/>
+      <w:bookmarkStart w:name="h_2" w:id="1"/>
       <w:r>
         <w:rPr>
           <w:rFonts w:ascii="Times New Roman" w:cs="Times New Roman" w:eastAsia="Times New Roman" w:hAnsi="Times New Roman"/>
@@ -2442,7 +2583,7 @@
         </w:rPr>
         <w:t xml:space="preserve">Purpose</w:t>
       </w:r>
-      <w:bookmarkEnd w:id="101"/>
+      <w:bookmarkEnd w:id="1"/>
     </w:p>
     <w:p>
       <w:pPr>
@@ -2475,7 +2616,7 @@
         <w:ind w:left="0" w:right="0" w:firstLine="0"/>
         <w:jc w:val="left"/>
       </w:pPr>
-      <w:bookmarkStart w:name="h_3" w:id="102"/>
+      <w:bookmarkStart w:name="h_3" w:id="1"/>
       <w:r>
         <w:rPr>
           <w:rFonts w:ascii="Times New Roman" w:cs="Times New Roman" w:eastAsia="Times New Roman" w:hAnsi="Times New Roman"/>
@@ -2487,9 +2628,9 @@
           <w:sz w:val="24"/>
           <w:szCs w:val="24"/>
         </w:rPr>
-        <w:t xml:space="preserve">Guiding Constraints</w:t>
+        <w:t xml:space="preserve">Guiding constraints</w:t>
       </w:r>
-      <w:bookmarkEnd w:id="102"/>
+      <w:bookmarkEnd w:id="1"/>
     </w:p>
     <w:p>
       <w:pPr>
@@ -2618,7 +2759,7 @@
         <w:ind w:left="0" w:right="0" w:firstLine="0"/>
         <w:jc w:val="left"/>
       </w:pPr>
-      <w:bookmarkStart w:name="h_4" w:id="103"/>
+      <w:bookmarkStart w:name="h_4" w:id="1"/>
       <w:r>
         <w:rPr>
           <w:rFonts w:ascii="Times New Roman" w:cs="Times New Roman" w:eastAsia="Times New Roman" w:hAnsi="Times New Roman"/>
@@ -2632,7 +2773,7 @@
         </w:rPr>
         <w:t xml:space="preserve">Technology</w:t>
       </w:r>
-      <w:bookmarkEnd w:id="103"/>
+      <w:bookmarkEnd w:id="1"/>
     </w:p>
     <w:p>
       <w:pPr>
@@ -2641,7 +2782,7 @@
         <w:ind w:left="0" w:right="0" w:firstLine="0"/>
         <w:jc w:val="left"/>
       </w:pPr>
-      <w:bookmarkStart w:name="tbl_1_1" w:id="104"/>
+      <w:bookmarkStart w:name="tbl_1_1" w:id="1"/>
       <w:r>
         <w:rPr>
           <w:rFonts w:ascii="Times New Roman" w:cs="Times New Roman" w:eastAsia="Times New Roman" w:hAnsi="Times New Roman"/>
@@ -2655,7 +2796,7 @@
         </w:rPr>
         <w:t xml:space="preserve">Table 1.1</w:t>
       </w:r>
-      <w:bookmarkEnd w:id="104"/>
+      <w:bookmarkEnd w:id="1"/>
       <w:r>
         <w:rPr>
           <w:rFonts w:ascii="Times New Roman" w:cs="Times New Roman" w:eastAsia="Times New Roman" w:hAnsi="Times New Roman"/>
@@ -2667,7 +2808,7 @@
           <w:sz w:val="18"/>
           <w:szCs w:val="18"/>
         </w:rPr>
-        <w:t xml:space="preserve">: Technology Choices and Their Reasons</w:t>
+        <w:t xml:space="preserve">: Technology choices and their reasons</w:t>
       </w:r>
     </w:p>
     <w:tbl>
@@ -3460,7 +3601,7 @@
                 <w:sz w:val="20"/>
                 <w:szCs w:val="20"/>
               </w:rPr>
-              <w:t xml:space="preserve">Matches the reviewed prototype, so the approved design carries across unchanged</w:t>
+              <w:t xml:space="preserve">Carries forward the direction reviewed in the prototype without treating that review as approval of every detail</w:t>
             </w:r>
           </w:p>
         </w:tc>
@@ -3922,7 +4063,7 @@
                 <w:sz w:val="20"/>
                 <w:szCs w:val="20"/>
               </w:rPr>
-              <w:t xml:space="preserve">Written in parallel so production is a deployment change rather than a rewrite</w:t>
+              <w:t xml:space="preserve">Defines all six application services, the web origin, Keycloak and two PostgreSQL instances while the final ICT hosting choice remains open</w:t>
             </w:r>
           </w:p>
         </w:tc>
@@ -3939,7 +4080,7 @@
         <w:ind w:left="0" w:right="0" w:firstLine="0"/>
         <w:jc w:val="left"/>
       </w:pPr>
-      <w:bookmarkStart w:name="h_5" w:id="105"/>
+      <w:bookmarkStart w:name="h_5" w:id="1"/>
       <w:r>
         <w:rPr>
           <w:rFonts w:ascii="Times New Roman" w:cs="Times New Roman" w:eastAsia="Times New Roman" w:hAnsi="Times New Roman"/>
@@ -3951,9 +4092,9 @@
           <w:sz w:val="24"/>
           <w:szCs w:val="24"/>
         </w:rPr>
-        <w:t xml:space="preserve">Service Topology</w:t>
+        <w:t xml:space="preserve">Service topology</w:t>
       </w:r>
-      <w:bookmarkEnd w:id="105"/>
+      <w:bookmarkEnd w:id="1"/>
     </w:p>
     <w:p>
       <w:pPr>
@@ -3966,7 +4107,7 @@
         <w:ind w:left="0" w:right="0" w:firstLine="0"/>
         <w:jc w:val="left"/>
       </w:pPr>
-      <w:bookmarkStart w:name="h_6" w:id="106"/>
+      <w:bookmarkStart w:name="h_6" w:id="1"/>
       <w:r>
         <w:rPr>
           <w:rFonts w:ascii="Times New Roman" w:cs="Times New Roman" w:eastAsia="Times New Roman" w:hAnsi="Times New Roman"/>
@@ -3980,7 +4121,7 @@
         </w:rPr>
         <w:t xml:space="preserve">Overview</w:t>
       </w:r>
-      <w:bookmarkEnd w:id="106"/>
+      <w:bookmarkEnd w:id="1"/>
     </w:p>
     <w:p>
       <w:pPr>
@@ -3999,7 +4140,7 @@
           <w:sz w:val="24"/>
           <w:szCs w:val="24"/>
         </w:rPr>
-        <w:t xml:space="preserve">The system is a set of independently deployable services, one per bounded context, behind a single gateway. Each owns its own database and exposes its data only through its own interface.</w:t>
+        <w:t xml:space="preserve">The system has six Go services behind one gateway route. Gateway, identity, clinical, admin, occupational and metrics are the application service set. The web origin and Keycloak are deployed separately, but they are edge and identity infrastructure rather than additional business contexts. Each stateful service owns its database and exposes data only through its interface.</w:t>
       </w:r>
     </w:p>
     <w:p>
@@ -4010,7 +4151,7 @@
       <w:r>
         <w:drawing>
           <wp:inline distT="0" distB="0" distL="0" distR="0">
-            <wp:extent cx="5905500" cy="3248025"/>
+            <wp:extent cx="5905500" cy="3695700"/>
             <wp:effectExtent t="0" r="0" b="0" l="0"/>
             <wp:docPr id="1" name="" descr="" title=""/>
             <wp:cNvGraphicFramePr>
@@ -4035,7 +4176,7 @@
                   <pic:spPr bwMode="auto">
                     <a:xfrm>
                       <a:off x="0" y="0"/>
-                      <a:ext cx="5905500" cy="3248025"/>
+                      <a:ext cx="5905500" cy="3695700"/>
                     </a:xfrm>
                     <a:prstGeom prst="rect">
                       <a:avLst/>
@@ -4055,7 +4196,7 @@
         <w:ind w:left="0" w:right="0" w:firstLine="0"/>
         <w:jc w:val="left"/>
       </w:pPr>
-      <w:bookmarkStart w:name="fig_2_1" w:id="107"/>
+      <w:bookmarkStart w:name="fig_2_1" w:id="1"/>
       <w:r>
         <w:rPr>
           <w:rFonts w:ascii="Times New Roman" w:cs="Times New Roman" w:eastAsia="Times New Roman" w:hAnsi="Times New Roman"/>
@@ -4069,7 +4210,7 @@
         </w:rPr>
         <w:t xml:space="preserve">Figure 2.1</w:t>
       </w:r>
-      <w:bookmarkEnd w:id="107"/>
+      <w:bookmarkEnd w:id="1"/>
       <w:r>
         <w:rPr>
           <w:rFonts w:ascii="Times New Roman" w:cs="Times New Roman" w:eastAsia="Times New Roman" w:hAnsi="Times New Roman"/>
@@ -4081,7 +4222,7 @@
           <w:sz w:val="18"/>
           <w:szCs w:val="18"/>
         </w:rPr>
-        <w:t xml:space="preserve">: Service Topology and Request Path</w:t>
+        <w:t xml:space="preserve">: Service topology and request path</w:t>
       </w:r>
     </w:p>
     <w:p>
@@ -4105,12 +4246,6 @@
       </w:r>
       <w:fldSimple w:instr="REF fig_2_1 \h">
         <w:r>
-          <w:rPr>
-            <w:rFonts w:ascii="Times New Roman" w:cs="Times New Roman" w:eastAsia="Times New Roman" w:hAnsi="Times New Roman"/>
-            <w:color w:val="000000"/>
-            <w:sz w:val="24"/>
-            <w:szCs w:val="24"/>
-          </w:rPr>
           <w:t xml:space="preserve">Figure 2.1</w:t>
         </w:r>
       </w:fldSimple>
@@ -4135,7 +4270,7 @@
         <w:ind w:left="0" w:right="0" w:firstLine="0"/>
         <w:jc w:val="left"/>
       </w:pPr>
-      <w:bookmarkStart w:name="tbl_2_1" w:id="108"/>
+      <w:bookmarkStart w:name="tbl_2_1" w:id="1"/>
       <w:r>
         <w:rPr>
           <w:rFonts w:ascii="Times New Roman" w:cs="Times New Roman" w:eastAsia="Times New Roman" w:hAnsi="Times New Roman"/>
@@ -4149,7 +4284,7 @@
         </w:rPr>
         <w:t xml:space="preserve">Table 2.1</w:t>
       </w:r>
-      <w:bookmarkEnd w:id="108"/>
+      <w:bookmarkEnd w:id="1"/>
       <w:r>
         <w:rPr>
           <w:rFonts w:ascii="Times New Roman" w:cs="Times New Roman" w:eastAsia="Times New Roman" w:hAnsi="Times New Roman"/>
@@ -4161,7 +4296,7 @@
           <w:sz w:val="18"/>
           <w:szCs w:val="18"/>
         </w:rPr>
-        <w:t xml:space="preserve">: Services and What Each Owns</w:t>
+        <w:t xml:space="preserve">: Six application services and what each owns</w:t>
       </w:r>
     </w:p>
     <w:tbl>
@@ -4338,7 +4473,7 @@
                 <w:sz w:val="20"/>
                 <w:szCs w:val="20"/>
               </w:rPr>
-              <w:t xml:space="preserve">Special Conditions</w:t>
+              <w:t xml:space="preserve">Special conditions</w:t>
             </w:r>
           </w:p>
         </w:tc>
@@ -4454,7 +4589,7 @@
                 <w:sz w:val="20"/>
                 <w:szCs w:val="20"/>
               </w:rPr>
-              <w:t xml:space="preserve">Sign in exchange, session, routing to services</w:t>
+              <w:t xml:space="preserve">Sign-in exchange, server-side session and routing</w:t>
             </w:r>
           </w:p>
         </w:tc>
@@ -4492,7 +4627,7 @@
                 <w:sz w:val="20"/>
                 <w:szCs w:val="20"/>
               </w:rPr>
-              <w:t xml:space="preserve">Holds no data and no business rule</w:t>
+              <w:t xml:space="preserve">Holds no business data. The browser receives an opaque cookie rather than a token</w:t>
             </w:r>
           </w:p>
         </w:tc>
@@ -4762,7 +4897,7 @@
                 <w:sz w:val="20"/>
                 <w:szCs w:val="20"/>
               </w:rPr>
-              <w:t xml:space="preserve">Patients, visits, laboratory requisitions and referrals</w:t>
+              <w:t xml:space="preserve">Patients, visits, laboratory requisitions, referrals and the leave outbox</w:t>
             </w:r>
           </w:p>
         </w:tc>
@@ -4800,7 +4935,7 @@
                 <w:sz w:val="20"/>
                 <w:szCs w:val="20"/>
               </w:rPr>
-              <w:t xml:space="preserve">Separate database instance, separate credentials, separate key</w:t>
+              <w:t xml:space="preserve">Separate database instance and the only holder of its credentials</w:t>
             </w:r>
           </w:p>
         </w:tc>
@@ -4878,7 +5013,7 @@
                 <w:sz w:val="20"/>
                 <w:szCs w:val="20"/>
               </w:rPr>
-              <w:t xml:space="preserve">Web</w:t>
+              <w:t xml:space="preserve">Admin</w:t>
             </w:r>
           </w:p>
         </w:tc>
@@ -4916,7 +5051,7 @@
                 <w:sz w:val="20"/>
                 <w:szCs w:val="20"/>
               </w:rPr>
-              <w:t xml:space="preserve">The single public origin, serving the interface</w:t>
+              <w:t xml:space="preserve">Effective-dated KPI targets and industrial hygiene limits</w:t>
             </w:r>
           </w:p>
         </w:tc>
@@ -4954,7 +5089,315 @@
                 <w:sz w:val="20"/>
                 <w:szCs w:val="20"/>
               </w:rPr>
-              <w:t xml:space="preserve">Proxies the sign in and interface paths to the gateway</w:t>
+              <w:t xml:space="preserve">Supersedes a value by closing its row and opening a dated replacement</w:t>
+            </w:r>
+          </w:p>
+        </w:tc>
+      </w:tr>
+      <w:tr>
+        <w:tc>
+          <w:tcPr>
+            <w:tcW w:type="dxa" w:w="620"/>
+            <w:tcBorders>
+              <w:top w:val="single" w:color="000000" w:sz="4"/>
+              <w:left w:val="single" w:color="000000" w:sz="4"/>
+              <w:bottom w:val="single" w:color="000000" w:sz="4"/>
+              <w:right w:val="single" w:color="000000" w:sz="4"/>
+            </w:tcBorders>
+            <w:tcMar>
+              <w:top w:type="dxa" w:w="60"/>
+              <w:left w:type="dxa" w:w="90"/>
+              <w:bottom w:type="dxa" w:w="60"/>
+              <w:right w:type="dxa" w:w="90"/>
+            </w:tcMar>
+            <w:vAlign w:val="center"/>
+          </w:tcPr>
+          <w:p>
+            <w:pPr>
+              <w:spacing w:after="0" w:line="240" w:lineRule="auto"/>
+              <w:ind w:left="0" w:right="0" w:firstLine="0"/>
+              <w:jc w:val="left"/>
+            </w:pPr>
+            <w:r>
+              <w:rPr>
+                <w:rFonts w:ascii="Times New Roman" w:cs="Times New Roman" w:eastAsia="Times New Roman" w:hAnsi="Times New Roman"/>
+                <w:b w:val="false"/>
+                <w:bCs w:val="false"/>
+                <w:i w:val="false"/>
+                <w:iCs w:val="false"/>
+                <w:color w:val="000000"/>
+                <w:sz w:val="20"/>
+                <w:szCs w:val="20"/>
+              </w:rPr>
+              <w:t xml:space="preserve">5</w:t>
+            </w:r>
+          </w:p>
+        </w:tc>
+        <w:tc>
+          <w:tcPr>
+            <w:tcW w:type="dxa" w:w="1553"/>
+            <w:tcBorders>
+              <w:top w:val="single" w:color="000000" w:sz="4"/>
+              <w:left w:val="single" w:color="000000" w:sz="4"/>
+              <w:bottom w:val="single" w:color="000000" w:sz="4"/>
+              <w:right w:val="single" w:color="000000" w:sz="4"/>
+            </w:tcBorders>
+            <w:tcMar>
+              <w:top w:type="dxa" w:w="60"/>
+              <w:left w:type="dxa" w:w="90"/>
+              <w:bottom w:type="dxa" w:w="60"/>
+              <w:right w:type="dxa" w:w="90"/>
+            </w:tcMar>
+            <w:vAlign w:val="center"/>
+          </w:tcPr>
+          <w:p>
+            <w:pPr>
+              <w:spacing w:after="0" w:line="240" w:lineRule="auto"/>
+              <w:ind w:left="0" w:right="0" w:firstLine="0"/>
+              <w:jc w:val="left"/>
+            </w:pPr>
+            <w:r>
+              <w:rPr>
+                <w:rFonts w:ascii="Times New Roman" w:cs="Times New Roman" w:eastAsia="Times New Roman" w:hAnsi="Times New Roman"/>
+                <w:b w:val="false"/>
+                <w:bCs w:val="false"/>
+                <w:i w:val="false"/>
+                <w:iCs w:val="false"/>
+                <w:color w:val="000000"/>
+                <w:sz w:val="20"/>
+                <w:szCs w:val="20"/>
+              </w:rPr>
+              <w:t xml:space="preserve">Occupational</w:t>
+            </w:r>
+          </w:p>
+        </w:tc>
+        <w:tc>
+          <w:tcPr>
+            <w:tcW w:type="dxa" w:w="4077"/>
+            <w:tcBorders>
+              <w:top w:val="single" w:color="000000" w:sz="4"/>
+              <w:left w:val="single" w:color="000000" w:sz="4"/>
+              <w:bottom w:val="single" w:color="000000" w:sz="4"/>
+              <w:right w:val="single" w:color="000000" w:sz="4"/>
+            </w:tcBorders>
+            <w:tcMar>
+              <w:top w:type="dxa" w:w="60"/>
+              <w:left w:type="dxa" w:w="90"/>
+              <w:bottom w:type="dxa" w:w="60"/>
+              <w:right w:type="dxa" w:w="90"/>
+            </w:tcMar>
+            <w:vAlign w:val="center"/>
+          </w:tcPr>
+          <w:p>
+            <w:pPr>
+              <w:spacing w:after="0" w:line="240" w:lineRule="auto"/>
+              <w:ind w:left="0" w:right="0" w:firstLine="0"/>
+              <w:jc w:val="left"/>
+            </w:pPr>
+            <w:r>
+              <w:rPr>
+                <w:rFonts w:ascii="Times New Roman" w:cs="Times New Roman" w:eastAsia="Times New Roman" w:hAnsi="Times New Roman"/>
+                <w:b w:val="false"/>
+                <w:bCs w:val="false"/>
+                <w:i w:val="false"/>
+                <w:iCs w:val="false"/>
+                <w:color w:val="000000"/>
+                <w:sz w:val="20"/>
+                <w:szCs w:val="20"/>
+              </w:rPr>
+              <w:t xml:space="preserve">Ergonomic assessments, corrective actions, hygiene monitoring events and readings</w:t>
+            </w:r>
+          </w:p>
+        </w:tc>
+        <w:tc>
+          <w:tcPr>
+            <w:tcW w:type="dxa" w:w="3495"/>
+            <w:tcBorders>
+              <w:top w:val="single" w:color="000000" w:sz="4"/>
+              <w:left w:val="single" w:color="000000" w:sz="4"/>
+              <w:bottom w:val="single" w:color="000000" w:sz="4"/>
+              <w:right w:val="single" w:color="000000" w:sz="4"/>
+            </w:tcBorders>
+            <w:tcMar>
+              <w:top w:type="dxa" w:w="60"/>
+              <w:left w:type="dxa" w:w="90"/>
+              <w:bottom w:type="dxa" w:w="60"/>
+              <w:right w:type="dxa" w:w="90"/>
+            </w:tcMar>
+            <w:vAlign w:val="center"/>
+          </w:tcPr>
+          <w:p>
+            <w:pPr>
+              <w:spacing w:after="0" w:line="240" w:lineRule="auto"/>
+              <w:ind w:left="0" w:right="0" w:firstLine="0"/>
+              <w:jc w:val="left"/>
+            </w:pPr>
+            <w:r>
+              <w:rPr>
+                <w:rFonts w:ascii="Times New Roman" w:cs="Times New Roman" w:eastAsia="Times New Roman" w:hAnsi="Times New Roman"/>
+                <w:b w:val="false"/>
+                <w:bCs w:val="false"/>
+                <w:i w:val="false"/>
+                <w:iCs w:val="false"/>
+                <w:color w:val="000000"/>
+                <w:sz w:val="20"/>
+                <w:szCs w:val="20"/>
+              </w:rPr>
+              <w:t xml:space="preserve">Holds no clinical content. A reading is a fact about a place</w:t>
+            </w:r>
+          </w:p>
+        </w:tc>
+      </w:tr>
+      <w:tr>
+        <w:tc>
+          <w:tcPr>
+            <w:tcW w:type="dxa" w:w="620"/>
+            <w:tcBorders>
+              <w:top w:val="single" w:color="000000" w:sz="4"/>
+              <w:left w:val="single" w:color="000000" w:sz="4"/>
+              <w:bottom w:val="single" w:color="000000" w:sz="4"/>
+              <w:right w:val="single" w:color="000000" w:sz="4"/>
+            </w:tcBorders>
+            <w:tcMar>
+              <w:top w:type="dxa" w:w="60"/>
+              <w:left w:type="dxa" w:w="90"/>
+              <w:bottom w:type="dxa" w:w="60"/>
+              <w:right w:type="dxa" w:w="90"/>
+            </w:tcMar>
+            <w:vAlign w:val="center"/>
+          </w:tcPr>
+          <w:p>
+            <w:pPr>
+              <w:spacing w:after="0" w:line="240" w:lineRule="auto"/>
+              <w:ind w:left="0" w:right="0" w:firstLine="0"/>
+              <w:jc w:val="left"/>
+            </w:pPr>
+            <w:r>
+              <w:rPr>
+                <w:rFonts w:ascii="Times New Roman" w:cs="Times New Roman" w:eastAsia="Times New Roman" w:hAnsi="Times New Roman"/>
+                <w:b w:val="false"/>
+                <w:bCs w:val="false"/>
+                <w:i w:val="false"/>
+                <w:iCs w:val="false"/>
+                <w:color w:val="000000"/>
+                <w:sz w:val="20"/>
+                <w:szCs w:val="20"/>
+              </w:rPr>
+              <w:t xml:space="preserve">6</w:t>
+            </w:r>
+          </w:p>
+        </w:tc>
+        <w:tc>
+          <w:tcPr>
+            <w:tcW w:type="dxa" w:w="1553"/>
+            <w:tcBorders>
+              <w:top w:val="single" w:color="000000" w:sz="4"/>
+              <w:left w:val="single" w:color="000000" w:sz="4"/>
+              <w:bottom w:val="single" w:color="000000" w:sz="4"/>
+              <w:right w:val="single" w:color="000000" w:sz="4"/>
+            </w:tcBorders>
+            <w:tcMar>
+              <w:top w:type="dxa" w:w="60"/>
+              <w:left w:type="dxa" w:w="90"/>
+              <w:bottom w:type="dxa" w:w="60"/>
+              <w:right w:type="dxa" w:w="90"/>
+            </w:tcMar>
+            <w:vAlign w:val="center"/>
+          </w:tcPr>
+          <w:p>
+            <w:pPr>
+              <w:spacing w:after="0" w:line="240" w:lineRule="auto"/>
+              <w:ind w:left="0" w:right="0" w:firstLine="0"/>
+              <w:jc w:val="left"/>
+            </w:pPr>
+            <w:r>
+              <w:rPr>
+                <w:rFonts w:ascii="Times New Roman" w:cs="Times New Roman" w:eastAsia="Times New Roman" w:hAnsi="Times New Roman"/>
+                <w:b w:val="false"/>
+                <w:bCs w:val="false"/>
+                <w:i w:val="false"/>
+                <w:iCs w:val="false"/>
+                <w:color w:val="000000"/>
+                <w:sz w:val="20"/>
+                <w:szCs w:val="20"/>
+              </w:rPr>
+              <w:t xml:space="preserve">Metrics</w:t>
+            </w:r>
+          </w:p>
+        </w:tc>
+        <w:tc>
+          <w:tcPr>
+            <w:tcW w:type="dxa" w:w="4077"/>
+            <w:tcBorders>
+              <w:top w:val="single" w:color="000000" w:sz="4"/>
+              <w:left w:val="single" w:color="000000" w:sz="4"/>
+              <w:bottom w:val="single" w:color="000000" w:sz="4"/>
+              <w:right w:val="single" w:color="000000" w:sz="4"/>
+            </w:tcBorders>
+            <w:tcMar>
+              <w:top w:type="dxa" w:w="60"/>
+              <w:left w:type="dxa" w:w="90"/>
+              <w:bottom w:type="dxa" w:w="60"/>
+              <w:right w:type="dxa" w:w="90"/>
+            </w:tcMar>
+            <w:vAlign w:val="center"/>
+          </w:tcPr>
+          <w:p>
+            <w:pPr>
+              <w:spacing w:after="0" w:line="240" w:lineRule="auto"/>
+              <w:ind w:left="0" w:right="0" w:firstLine="0"/>
+              <w:jc w:val="left"/>
+            </w:pPr>
+            <w:r>
+              <w:rPr>
+                <w:rFonts w:ascii="Times New Roman" w:cs="Times New Roman" w:eastAsia="Times New Roman" w:hAnsi="Times New Roman"/>
+                <w:b w:val="false"/>
+                <w:bCs w:val="false"/>
+                <w:i w:val="false"/>
+                <w:iCs w:val="false"/>
+                <w:color w:val="000000"/>
+                <w:sz w:val="20"/>
+                <w:szCs w:val="20"/>
+              </w:rPr>
+              <w:t xml:space="preserve">Monthly returns, kept corrections, KPI computation and the dashboard</w:t>
+            </w:r>
+          </w:p>
+        </w:tc>
+        <w:tc>
+          <w:tcPr>
+            <w:tcW w:type="dxa" w:w="3495"/>
+            <w:tcBorders>
+              <w:top w:val="single" w:color="000000" w:sz="4"/>
+              <w:left w:val="single" w:color="000000" w:sz="4"/>
+              <w:bottom w:val="single" w:color="000000" w:sz="4"/>
+              <w:right w:val="single" w:color="000000" w:sz="4"/>
+            </w:tcBorders>
+            <w:tcMar>
+              <w:top w:type="dxa" w:w="60"/>
+              <w:left w:type="dxa" w:w="90"/>
+              <w:bottom w:type="dxa" w:w="60"/>
+              <w:right w:type="dxa" w:w="90"/>
+            </w:tcMar>
+            <w:vAlign w:val="center"/>
+          </w:tcPr>
+          <w:p>
+            <w:pPr>
+              <w:spacing w:after="0" w:line="240" w:lineRule="auto"/>
+              <w:ind w:left="0" w:right="0" w:firstLine="0"/>
+              <w:jc w:val="left"/>
+            </w:pPr>
+            <w:r>
+              <w:rPr>
+                <w:rFonts w:ascii="Times New Roman" w:cs="Times New Roman" w:eastAsia="Times New Roman" w:hAnsi="Times New Roman"/>
+                <w:b w:val="false"/>
+                <w:bCs w:val="false"/>
+                <w:i w:val="false"/>
+                <w:iCs w:val="false"/>
+                <w:color w:val="000000"/>
+                <w:sz w:val="20"/>
+                <w:szCs w:val="20"/>
+              </w:rPr>
+              <w:t xml:space="preserve">Holds no clinical database credential of any kind</w:t>
             </w:r>
           </w:p>
         </w:tc>
@@ -4977,7 +5420,7 @@
           <w:sz w:val="24"/>
           <w:szCs w:val="24"/>
         </w:rPr>
-        <w:t xml:space="preserve">Two further services are specified and not yet built. Occupational, covering ergonomics and industrial hygiene, and metrics, covering monthly returns and indicator computation. They are named here because their boundaries are already decided and the interface already routes to them.</w:t>
+        <w:t xml:space="preserve">The web deployment serves the signed-in interface and proxies the browser to the gateway. Keycloak supplies identity and the KMC login theme. They remain separate deployables so each can be operated and upgraded for its own purpose, but neither owns divisional records.</w:t>
       </w:r>
     </w:p>
     <w:p>
@@ -4991,7 +5434,7 @@
         <w:ind w:left="0" w:right="0" w:firstLine="0"/>
         <w:jc w:val="left"/>
       </w:pPr>
-      <w:bookmarkStart w:name="h_7" w:id="109"/>
+      <w:bookmarkStart w:name="h_7" w:id="1"/>
       <w:r>
         <w:rPr>
           <w:rFonts w:ascii="Times New Roman" w:cs="Times New Roman" w:eastAsia="Times New Roman" w:hAnsi="Times New Roman"/>
@@ -5003,9 +5446,9 @@
           <w:sz w:val="24"/>
           <w:szCs w:val="24"/>
         </w:rPr>
-        <w:t xml:space="preserve">Why Not a Single Application</w:t>
+        <w:t xml:space="preserve">Why not a single application</w:t>
       </w:r>
-      <w:bookmarkEnd w:id="109"/>
+      <w:bookmarkEnd w:id="1"/>
     </w:p>
     <w:p>
       <w:pPr>
@@ -5078,7 +5521,7 @@
         <w:ind w:left="0" w:right="0" w:firstLine="0"/>
         <w:jc w:val="left"/>
       </w:pPr>
-      <w:bookmarkStart w:name="h_8" w:id="110"/>
+      <w:bookmarkStart w:name="h_8" w:id="1"/>
       <w:r>
         <w:rPr>
           <w:rFonts w:ascii="Times New Roman" w:cs="Times New Roman" w:eastAsia="Times New Roman" w:hAnsi="Times New Roman"/>
@@ -5092,7 +5535,7 @@
         </w:rPr>
         <w:t xml:space="preserve">Communication</w:t>
       </w:r>
-      <w:bookmarkEnd w:id="110"/>
+      <w:bookmarkEnd w:id="1"/>
     </w:p>
     <w:p>
       <w:pPr>
@@ -5131,21 +5574,21 @@
           <w:sz w:val="24"/>
           <w:szCs w:val="24"/>
         </w:rPr>
-        <w:t xml:space="preserve">One communication rule is not negotiable. No service other than the clinical service reads a clinical record. Where another context requires clinical information it receives counts and non identifying facts, never records. A reporting service therefore receives the number of visits in a period and never the visits themselves.</w:t>
+        <w:t xml:space="preserve">One communication rule is not negotiable. No service other than the clinical service reads a clinical record. Where another context requires a clinical contribution it receives an agreed non-identifying fact, never the record from which it came. This is why metrics can compute absenteeism while holding no clinical credential.</w:t>
       </w:r>
     </w:p>
     <w:p>
       <w:pPr>
-        <w:pStyle w:val="Heading1"/>
+        <w:pStyle w:val="Heading2"/>
         <w:numPr>
-          <w:ilvl w:val="0"/>
+          <w:ilvl w:val="1"/>
           <w:numId w:val="2"/>
         </w:numPr>
-        <w:spacing w:after="170" w:before="300"/>
+        <w:spacing w:after="150" w:before="270"/>
         <w:ind w:left="0" w:right="0" w:firstLine="0"/>
         <w:jc w:val="left"/>
       </w:pPr>
-      <w:bookmarkStart w:name="h_9" w:id="111"/>
+      <w:bookmarkStart w:name="h_9" w:id="1"/>
       <w:r>
         <w:rPr>
           <w:rFonts w:ascii="Times New Roman" w:cs="Times New Roman" w:eastAsia="Times New Roman" w:hAnsi="Times New Roman"/>
@@ -5157,22 +5600,82 @@
           <w:sz w:val="24"/>
           <w:szCs w:val="24"/>
         </w:rPr>
-        <w:t xml:space="preserve">Identity and Session</w:t>
+        <w:t xml:space="preserve">Clinical event boundary</w:t>
       </w:r>
-      <w:bookmarkEnd w:id="111"/>
+      <w:bookmarkEnd w:id="1"/>
     </w:p>
     <w:p>
       <w:pPr>
-        <w:pStyle w:val="Heading2"/>
+        <w:spacing w:after="160" w:line="276" w:lineRule="auto"/>
+        <w:ind w:left="0" w:right="0" w:firstLine="0"/>
+        <w:jc w:val="both"/>
+      </w:pPr>
+      <w:r>
+        <w:rPr>
+          <w:rFonts w:ascii="Times New Roman" w:cs="Times New Roman" w:eastAsia="Times New Roman" w:hAnsi="Times New Roman"/>
+          <w:b w:val="false"/>
+          <w:bCs w:val="false"/>
+          <w:i w:val="false"/>
+          <w:iCs w:val="false"/>
+          <w:color w:val="000000"/>
+          <w:sz w:val="24"/>
+          <w:szCs w:val="24"/>
+        </w:rPr>
+        <w:t xml:space="preserve">When facility feedback records recommended sick leave, the clinical service writes the feedback and a leave contribution to referral_leave_outbox in one database transaction. Delivery can then retry without making the clinical save depend on metrics availability, and a successful clinical save cannot lose its contribution between two separate writes.</w:t>
+      </w:r>
+    </w:p>
+    <w:p>
+      <w:pPr>
+        <w:spacing w:after="160" w:line="276" w:lineRule="auto"/>
+        <w:ind w:left="0" w:right="0" w:firstLine="0"/>
+        <w:jc w:val="both"/>
+      </w:pPr>
+      <w:r>
+        <w:rPr>
+          <w:rFonts w:ascii="Times New Roman" w:cs="Times New Roman" w:eastAsia="Times New Roman" w:hAnsi="Times New Roman"/>
+          <w:b w:val="false"/>
+          <w:bCs w:val="false"/>
+          <w:i w:val="false"/>
+          <w:iCs w:val="false"/>
+          <w:color w:val="000000"/>
+          <w:sz w:val="24"/>
+          <w:szCs w:val="24"/>
+        </w:rPr>
+        <w:t xml:space="preserve">The publisher sends four fields to the internal metrics route: referral identifier, feedback version, reporting month and days. It sends no patient identifier, name, diagnosis, treatment or free text. Contract tests in both clinical and metrics inspect their migration column sets and fail the ordinary build if either side widens, because metrics has no clinical credential and must not become a second clinical store by gradual schema change.</w:t>
+      </w:r>
+    </w:p>
+    <w:p>
+      <w:pPr>
+        <w:spacing w:after="160" w:line="276" w:lineRule="auto"/>
+        <w:ind w:left="0" w:right="0" w:firstLine="0"/>
+        <w:jc w:val="both"/>
+      </w:pPr>
+      <w:r>
+        <w:rPr>
+          <w:rFonts w:ascii="Times New Roman" w:cs="Times New Roman" w:eastAsia="Times New Roman" w:hAnsi="Times New Roman"/>
+          <w:b w:val="false"/>
+          <w:bCs w:val="false"/>
+          <w:i w:val="false"/>
+          <w:iCs w:val="false"/>
+          <w:color w:val="000000"/>
+          <w:sz w:val="24"/>
+          <w:szCs w:val="24"/>
+        </w:rPr>
+        <w:t xml:space="preserve">Delivery is direct HTTP and at least once. Metrics is idempotent by referral identifier and feedback version, and retains the highest version as active, so a retry or an out-of-order correction changes the total once. Authentication currently uses a shared secret on an internal route rather than a scoped OIDC service account. That is a production weakness recorded at DEC-034, not a property this architecture treats as complete.</w:t>
+      </w:r>
+    </w:p>
+    <w:p>
+      <w:pPr>
+        <w:pStyle w:val="Heading1"/>
         <w:numPr>
-          <w:ilvl w:val="1"/>
+          <w:ilvl w:val="0"/>
           <w:numId w:val="2"/>
         </w:numPr>
-        <w:spacing w:after="150" w:before="270"/>
+        <w:spacing w:after="170" w:before="300"/>
         <w:ind w:left="0" w:right="0" w:firstLine="0"/>
         <w:jc w:val="left"/>
       </w:pPr>
-      <w:bookmarkStart w:name="h_10" w:id="112"/>
+      <w:bookmarkStart w:name="h_10" w:id="1"/>
       <w:r>
         <w:rPr>
           <w:rFonts w:ascii="Times New Roman" w:cs="Times New Roman" w:eastAsia="Times New Roman" w:hAnsi="Times New Roman"/>
@@ -5184,9 +5687,36 @@
           <w:sz w:val="24"/>
           <w:szCs w:val="24"/>
         </w:rPr>
-        <w:t xml:space="preserve">The Backend for Frontend Pattern</w:t>
+        <w:t xml:space="preserve">Identity and session</w:t>
       </w:r>
-      <w:bookmarkEnd w:id="112"/>
+      <w:bookmarkEnd w:id="1"/>
+    </w:p>
+    <w:p>
+      <w:pPr>
+        <w:pStyle w:val="Heading2"/>
+        <w:numPr>
+          <w:ilvl w:val="1"/>
+          <w:numId w:val="2"/>
+        </w:numPr>
+        <w:spacing w:after="150" w:before="270"/>
+        <w:ind w:left="0" w:right="0" w:firstLine="0"/>
+        <w:jc w:val="left"/>
+      </w:pPr>
+      <w:bookmarkStart w:name="h_11" w:id="1"/>
+      <w:r>
+        <w:rPr>
+          <w:rFonts w:ascii="Times New Roman" w:cs="Times New Roman" w:eastAsia="Times New Roman" w:hAnsi="Times New Roman"/>
+          <w:b/>
+          <w:bCs/>
+          <w:i w:val="false"/>
+          <w:iCs w:val="false"/>
+          <w:color w:val="000000"/>
+          <w:sz w:val="24"/>
+          <w:szCs w:val="24"/>
+        </w:rPr>
+        <w:t xml:space="preserve">The backend for frontend pattern</w:t>
+      </w:r>
+      <w:bookmarkEnd w:id="1"/>
     </w:p>
     <w:p>
       <w:pPr>
@@ -5239,7 +5769,7 @@
         <w:ind w:left="0" w:right="0" w:firstLine="0"/>
         <w:jc w:val="left"/>
       </w:pPr>
-      <w:bookmarkStart w:name="h_11" w:id="113"/>
+      <w:bookmarkStart w:name="h_12" w:id="1"/>
       <w:r>
         <w:rPr>
           <w:rFonts w:ascii="Times New Roman" w:cs="Times New Roman" w:eastAsia="Times New Roman" w:hAnsi="Times New Roman"/>
@@ -5253,7 +5783,7 @@
         </w:rPr>
         <w:t xml:space="preserve">Roles</w:t>
       </w:r>
-      <w:bookmarkEnd w:id="113"/>
+      <w:bookmarkEnd w:id="1"/>
     </w:p>
     <w:p>
       <w:pPr>
@@ -5282,7 +5812,7 @@
         <w:ind w:left="0" w:right="0" w:firstLine="0"/>
         <w:jc w:val="left"/>
       </w:pPr>
-      <w:bookmarkStart w:name="tbl_3_1" w:id="114"/>
+      <w:bookmarkStart w:name="tbl_3_1" w:id="1"/>
       <w:r>
         <w:rPr>
           <w:rFonts w:ascii="Times New Roman" w:cs="Times New Roman" w:eastAsia="Times New Roman" w:hAnsi="Times New Roman"/>
@@ -5296,7 +5826,7 @@
         </w:rPr>
         <w:t xml:space="preserve">Table 3.1</w:t>
       </w:r>
-      <w:bookmarkEnd w:id="114"/>
+      <w:bookmarkEnd w:id="1"/>
       <w:r>
         <w:rPr>
           <w:rFonts w:ascii="Times New Roman" w:cs="Times New Roman" w:eastAsia="Times New Roman" w:hAnsi="Times New Roman"/>
@@ -5308,7 +5838,7 @@
           <w:sz w:val="18"/>
           <w:szCs w:val="18"/>
         </w:rPr>
-        <w:t xml:space="preserve">: Roles as Held in the Identity Provider</w:t>
+        <w:t xml:space="preserve">: Roles as held in the identity provider</w:t>
       </w:r>
     </w:p>
     <w:tbl>
@@ -5485,7 +6015,7 @@
                 <w:sz w:val="20"/>
                 <w:szCs w:val="20"/>
               </w:rPr>
-              <w:t xml:space="preserve">Clinical Scope</w:t>
+              <w:t xml:space="preserve">Clinical scope</w:t>
             </w:r>
           </w:p>
         </w:tc>
@@ -5984,7 +6514,7 @@
         <w:ind w:left="0" w:right="0" w:firstLine="0"/>
         <w:jc w:val="left"/>
       </w:pPr>
-      <w:bookmarkStart w:name="h_12" w:id="115"/>
+      <w:bookmarkStart w:name="h_13" w:id="1"/>
       <w:r>
         <w:rPr>
           <w:rFonts w:ascii="Times New Roman" w:cs="Times New Roman" w:eastAsia="Times New Roman" w:hAnsi="Times New Roman"/>
@@ -5996,9 +6526,9 @@
           <w:sz w:val="24"/>
           <w:szCs w:val="24"/>
         </w:rPr>
-        <w:t xml:space="preserve">Account Administration</w:t>
+        <w:t xml:space="preserve">Account administration</w:t>
       </w:r>
-      <w:bookmarkEnd w:id="115"/>
+      <w:bookmarkEnd w:id="1"/>
     </w:p>
     <w:p>
       <w:pPr>
@@ -6042,6 +6572,53 @@
     </w:p>
     <w:p>
       <w:pPr>
+        <w:pStyle w:val="Heading2"/>
+        <w:numPr>
+          <w:ilvl w:val="1"/>
+          <w:numId w:val="2"/>
+        </w:numPr>
+        <w:spacing w:after="150" w:before="270"/>
+        <w:ind w:left="0" w:right="0" w:firstLine="0"/>
+        <w:jc w:val="left"/>
+      </w:pPr>
+      <w:bookmarkStart w:name="h_14" w:id="1"/>
+      <w:r>
+        <w:rPr>
+          <w:rFonts w:ascii="Times New Roman" w:cs="Times New Roman" w:eastAsia="Times New Roman" w:hAnsi="Times New Roman"/>
+          <w:b/>
+          <w:bCs/>
+          <w:i w:val="false"/>
+          <w:iCs w:val="false"/>
+          <w:color w:val="000000"/>
+          <w:sz w:val="24"/>
+          <w:szCs w:val="24"/>
+        </w:rPr>
+        <w:t xml:space="preserve">Branding at sign-in and after sign-in</w:t>
+      </w:r>
+      <w:bookmarkEnd w:id="1"/>
+    </w:p>
+    <w:p>
+      <w:pPr>
+        <w:spacing w:after="160" w:line="276" w:lineRule="auto"/>
+        <w:ind w:left="0" w:right="0" w:firstLine="0"/>
+        <w:jc w:val="both"/>
+      </w:pPr>
+      <w:r>
+        <w:rPr>
+          <w:rFonts w:ascii="Times New Roman" w:cs="Times New Roman" w:eastAsia="Times New Roman" w:hAnsi="Times New Roman"/>
+          <w:b w:val="false"/>
+          <w:bCs w:val="false"/>
+          <w:i w:val="false"/>
+          <w:iCs w:val="false"/>
+          <w:color w:val="000000"/>
+          <w:sz w:val="24"/>
+          <w:szCs w:val="24"/>
+        </w:rPr>
+        <w:t xml:space="preserve">The Keycloak realm selects the KMC login theme, covering sign-in, required password change, errors and expired sign-in attempts. The signed-in shell carries the KMC lockup, department, system title, user and active role. The role remains visible because access differs materially by role, and a user must be able to tell which authority is active without opening a menu. The final product name remains open at DEC-028, so the current QHSE Management System wording is an implementation position rather than an approved name.</w:t>
+      </w:r>
+    </w:p>
+    <w:p>
+      <w:pPr>
         <w:pStyle w:val="Heading1"/>
         <w:numPr>
           <w:ilvl w:val="0"/>
@@ -6051,7 +6628,7 @@
         <w:ind w:left="0" w:right="0" w:firstLine="0"/>
         <w:jc w:val="left"/>
       </w:pPr>
-      <w:bookmarkStart w:name="h_13" w:id="116"/>
+      <w:bookmarkStart w:name="h_15" w:id="1"/>
       <w:r>
         <w:rPr>
           <w:rFonts w:ascii="Times New Roman" w:cs="Times New Roman" w:eastAsia="Times New Roman" w:hAnsi="Times New Roman"/>
@@ -6065,7 +6642,7 @@
         </w:rPr>
         <w:t xml:space="preserve">Data</w:t>
       </w:r>
-      <w:bookmarkEnd w:id="116"/>
+      <w:bookmarkEnd w:id="1"/>
     </w:p>
     <w:p>
       <w:pPr>
@@ -6078,7 +6655,7 @@
         <w:ind w:left="0" w:right="0" w:firstLine="0"/>
         <w:jc w:val="left"/>
       </w:pPr>
-      <w:bookmarkStart w:name="h_14" w:id="117"/>
+      <w:bookmarkStart w:name="h_16" w:id="1"/>
       <w:r>
         <w:rPr>
           <w:rFonts w:ascii="Times New Roman" w:cs="Times New Roman" w:eastAsia="Times New Roman" w:hAnsi="Times New Roman"/>
@@ -6090,9 +6667,9 @@
           <w:sz w:val="24"/>
           <w:szCs w:val="24"/>
         </w:rPr>
-        <w:t xml:space="preserve">Ownership Rules</w:t>
+        <w:t xml:space="preserve">Ownership rules</w:t>
       </w:r>
-      <w:bookmarkEnd w:id="117"/>
+      <w:bookmarkEnd w:id="1"/>
     </w:p>
     <w:p>
       <w:pPr>
@@ -6101,7 +6678,7 @@
         <w:ind w:left="0" w:right="0" w:firstLine="0"/>
         <w:jc w:val="left"/>
       </w:pPr>
-      <w:bookmarkStart w:name="tbl_4_1" w:id="118"/>
+      <w:bookmarkStart w:name="tbl_4_1" w:id="1"/>
       <w:r>
         <w:rPr>
           <w:rFonts w:ascii="Times New Roman" w:cs="Times New Roman" w:eastAsia="Times New Roman" w:hAnsi="Times New Roman"/>
@@ -6115,7 +6692,7 @@
         </w:rPr>
         <w:t xml:space="preserve">Table 4.1</w:t>
       </w:r>
-      <w:bookmarkEnd w:id="118"/>
+      <w:bookmarkEnd w:id="1"/>
       <w:r>
         <w:rPr>
           <w:rFonts w:ascii="Times New Roman" w:cs="Times New Roman" w:eastAsia="Times New Roman" w:hAnsi="Times New Roman"/>
@@ -6127,7 +6704,7 @@
           <w:sz w:val="18"/>
           <w:szCs w:val="18"/>
         </w:rPr>
-        <w:t xml:space="preserve">: Data Ownership Rules</w:t>
+        <w:t xml:space="preserve">: Data ownership rules</w:t>
       </w:r>
     </w:p>
     <w:tbl>
@@ -6342,7 +6919,7 @@
                 <w:sz w:val="20"/>
                 <w:szCs w:val="20"/>
               </w:rPr>
-              <w:t xml:space="preserve">One database per service</w:t>
+              <w:t xml:space="preserve">One database per stateful service</w:t>
             </w:r>
           </w:p>
         </w:tc>
@@ -6380,7 +6957,7 @@
                 <w:sz w:val="20"/>
                 <w:szCs w:val="20"/>
               </w:rPr>
-              <w:t xml:space="preserve">A service reads and writes its own database and no other</w:t>
+              <w:t xml:space="preserve">Identity, clinical, admin, occupational and metrics each read and write their own database and no other</w:t>
             </w:r>
           </w:p>
         </w:tc>
@@ -6922,7 +7499,7 @@
                 <w:sz w:val="20"/>
                 <w:szCs w:val="20"/>
               </w:rPr>
-              <w:t xml:space="preserve">Append only logs</w:t>
+              <w:t xml:space="preserve">Clinical access log</w:t>
             </w:r>
           </w:p>
         </w:tc>
@@ -6960,7 +7537,7 @@
                 <w:sz w:val="20"/>
                 <w:szCs w:val="20"/>
               </w:rPr>
-              <w:t xml:space="preserve">The audit trail and the clinical access log accept inserts and reads only, enforced by the database role</w:t>
+              <w:t xml:space="preserve">The clinical service writes the log before returning a record. The table is in the clinical database and its service role is not prevented from updating or deleting rows</w:t>
             </w:r>
           </w:p>
         </w:tc>
@@ -6977,7 +7554,7 @@
         <w:ind w:left="0" w:right="0" w:firstLine="0"/>
         <w:jc w:val="left"/>
       </w:pPr>
-      <w:bookmarkStart w:name="h_15" w:id="119"/>
+      <w:bookmarkStart w:name="h_17" w:id="1"/>
       <w:r>
         <w:rPr>
           <w:rFonts w:ascii="Times New Roman" w:cs="Times New Roman" w:eastAsia="Times New Roman" w:hAnsi="Times New Roman"/>
@@ -6989,9 +7566,9 @@
           <w:sz w:val="24"/>
           <w:szCs w:val="24"/>
         </w:rPr>
-        <w:t xml:space="preserve">The Clinical Schema</w:t>
+        <w:t xml:space="preserve">The clinical schema</w:t>
       </w:r>
-      <w:bookmarkEnd w:id="119"/>
+      <w:bookmarkEnd w:id="1"/>
     </w:p>
     <w:p>
       <w:pPr>
@@ -7010,7 +7587,7 @@
           <w:sz w:val="24"/>
           <w:szCs w:val="24"/>
         </w:rPr>
-        <w:t xml:space="preserve">The clinical context holds five tables. Patients, visits, the state and content of each section of a visit, laboratory requisitions with the investigations requested against them, and the clinical access log.</w:t>
+        <w:t xml:space="preserve">The clinical context holds patients, visits, the state and content of visit sections, laboratory requisitions and requested investigations, referrals and authorisations, the referral leave outbox, and the clinical access log. They remain together because every one is an individual clinical record or a narrow fact derived from one under the same transaction boundary.</w:t>
       </w:r>
     </w:p>
     <w:p>
@@ -7055,6 +7632,26 @@
     </w:p>
     <w:p>
       <w:pPr>
+        <w:spacing w:after="160" w:line="276" w:lineRule="auto"/>
+        <w:ind w:left="0" w:right="0" w:firstLine="0"/>
+        <w:jc w:val="both"/>
+      </w:pPr>
+      <w:r>
+        <w:rPr>
+          <w:rFonts w:ascii="Times New Roman" w:cs="Times New Roman" w:eastAsia="Times New Roman" w:hAnsi="Times New Roman"/>
+          <w:b w:val="false"/>
+          <w:bCs w:val="false"/>
+          <w:i w:val="false"/>
+          <w:iCs w:val="false"/>
+          <w:color w:val="000000"/>
+          <w:sz w:val="24"/>
+          <w:szCs w:val="24"/>
+        </w:rPr>
+        <w:t xml:space="preserve">The access log is not append-only against the database role used by the clinical service. The code has no update or delete operation for it, but no grant prevents that role issuing one and there is no separate hwms-audit deployable. The intended audit boundary therefore remains a production requirement rather than a delivered architectural property.</w:t>
+      </w:r>
+    </w:p>
+    <w:p>
+      <w:pPr>
         <w:pStyle w:val="Heading2"/>
         <w:numPr>
           <w:ilvl w:val="1"/>
@@ -7064,7 +7661,7 @@
         <w:ind w:left="0" w:right="0" w:firstLine="0"/>
         <w:jc w:val="left"/>
       </w:pPr>
-      <w:bookmarkStart w:name="h_16" w:id="120"/>
+      <w:bookmarkStart w:name="h_18" w:id="1"/>
       <w:r>
         <w:rPr>
           <w:rFonts w:ascii="Times New Roman" w:cs="Times New Roman" w:eastAsia="Times New Roman" w:hAnsi="Times New Roman"/>
@@ -7076,9 +7673,9 @@
           <w:sz w:val="24"/>
           <w:szCs w:val="24"/>
         </w:rPr>
-        <w:t xml:space="preserve">Snapshots on Forms</w:t>
+        <w:t xml:space="preserve">Snapshots on forms</w:t>
       </w:r>
-      <w:bookmarkEnd w:id="120"/>
+      <w:bookmarkEnd w:id="1"/>
     </w:p>
     <w:p>
       <w:pPr>
@@ -7102,6 +7699,73 @@
     </w:p>
     <w:p>
       <w:pPr>
+        <w:pStyle w:val="Heading2"/>
+        <w:numPr>
+          <w:ilvl w:val="1"/>
+          <w:numId w:val="2"/>
+        </w:numPr>
+        <w:spacing w:after="150" w:before="270"/>
+        <w:ind w:left="0" w:right="0" w:firstLine="0"/>
+        <w:jc w:val="left"/>
+      </w:pPr>
+      <w:bookmarkStart w:name="h_19" w:id="1"/>
+      <w:r>
+        <w:rPr>
+          <w:rFonts w:ascii="Times New Roman" w:cs="Times New Roman" w:eastAsia="Times New Roman" w:hAnsi="Times New Roman"/>
+          <w:b/>
+          <w:bCs/>
+          <w:i w:val="false"/>
+          <w:iCs w:val="false"/>
+          <w:color w:val="000000"/>
+          <w:sz w:val="24"/>
+          <w:szCs w:val="24"/>
+        </w:rPr>
+        <w:t xml:space="preserve">Effective-dated reference data and frozen evaluations</w:t>
+      </w:r>
+      <w:bookmarkEnd w:id="1"/>
+    </w:p>
+    <w:p>
+      <w:pPr>
+        <w:spacing w:after="160" w:line="276" w:lineRule="auto"/>
+        <w:ind w:left="0" w:right="0" w:firstLine="0"/>
+        <w:jc w:val="both"/>
+      </w:pPr>
+      <w:r>
+        <w:rPr>
+          <w:rFonts w:ascii="Times New Roman" w:cs="Times New Roman" w:eastAsia="Times New Roman" w:hAnsi="Times New Roman"/>
+          <w:b w:val="false"/>
+          <w:bCs w:val="false"/>
+          <w:i w:val="false"/>
+          <w:iCs w:val="false"/>
+          <w:color w:val="000000"/>
+          <w:sz w:val="24"/>
+          <w:szCs w:val="24"/>
+        </w:rPr>
+        <w:t xml:space="preserve">The admin service holds KPI targets and industrial hygiene limits with an effective start date, an optional end date, a source and an approval state. Superseding a value closes the row in force and creates a replacement from a later date. Historical values remain available because changing a threshold is a business decision and must not silently rewrite earlier performance.</w:t>
+      </w:r>
+    </w:p>
+    <w:p>
+      <w:pPr>
+        <w:spacing w:after="160" w:line="276" w:lineRule="auto"/>
+        <w:ind w:left="0" w:right="0" w:firstLine="0"/>
+        <w:jc w:val="both"/>
+      </w:pPr>
+      <w:r>
+        <w:rPr>
+          <w:rFonts w:ascii="Times New Roman" w:cs="Times New Roman" w:eastAsia="Times New Roman" w:hAnsi="Times New Roman"/>
+          <w:b w:val="false"/>
+          <w:bCs w:val="false"/>
+          <w:i w:val="false"/>
+          <w:iCs w:val="false"/>
+          <w:color w:val="000000"/>
+          <w:sz w:val="24"/>
+          <w:szCs w:val="24"/>
+        </w:rPr>
+        <w:t xml:space="preserve">A hygiene reading asks admin for the limit in force on the reading date. Occupational copies the reference identifier, value, unit, averaging period, monitoring context, standard family and standard version onto the reading, then writes the compliance result. A database trigger refuses later changes to the measurement, the copied reference data or the result. This makes a past evaluation independent of any later limit revision.</w:t>
+      </w:r>
+    </w:p>
+    <w:p>
+      <w:pPr>
         <w:pStyle w:val="Heading1"/>
         <w:numPr>
           <w:ilvl w:val="0"/>
@@ -7111,7 +7775,7 @@
         <w:ind w:left="0" w:right="0" w:firstLine="0"/>
         <w:jc w:val="left"/>
       </w:pPr>
-      <w:bookmarkStart w:name="h_17" w:id="121"/>
+      <w:bookmarkStart w:name="h_20" w:id="1"/>
       <w:r>
         <w:rPr>
           <w:rFonts w:ascii="Times New Roman" w:cs="Times New Roman" w:eastAsia="Times New Roman" w:hAnsi="Times New Roman"/>
@@ -7125,7 +7789,7 @@
         </w:rPr>
         <w:t xml:space="preserve">Deployment</w:t>
       </w:r>
-      <w:bookmarkEnd w:id="121"/>
+      <w:bookmarkEnd w:id="1"/>
     </w:p>
     <w:p>
       <w:pPr>
@@ -7138,7 +7802,7 @@
         <w:ind w:left="0" w:right="0" w:firstLine="0"/>
         <w:jc w:val="left"/>
       </w:pPr>
-      <w:bookmarkStart w:name="h_18" w:id="122"/>
+      <w:bookmarkStart w:name="h_21" w:id="1"/>
       <w:r>
         <w:rPr>
           <w:rFonts w:ascii="Times New Roman" w:cs="Times New Roman" w:eastAsia="Times New Roman" w:hAnsi="Times New Roman"/>
@@ -7152,7 +7816,7 @@
         </w:rPr>
         <w:t xml:space="preserve">Environments</w:t>
       </w:r>
-      <w:bookmarkEnd w:id="122"/>
+      <w:bookmarkEnd w:id="1"/>
     </w:p>
     <w:p>
       <w:pPr>
@@ -7227,7 +7891,7 @@
         <w:ind w:left="0" w:right="0" w:firstLine="0"/>
         <w:jc w:val="left"/>
       </w:pPr>
-      <w:bookmarkStart w:name="fig_5_1" w:id="123"/>
+      <w:bookmarkStart w:name="fig_5_1" w:id="1"/>
       <w:r>
         <w:rPr>
           <w:rFonts w:ascii="Times New Roman" w:cs="Times New Roman" w:eastAsia="Times New Roman" w:hAnsi="Times New Roman"/>
@@ -7241,7 +7905,7 @@
         </w:rPr>
         <w:t xml:space="preserve">Figure 5.1</w:t>
       </w:r>
-      <w:bookmarkEnd w:id="123"/>
+      <w:bookmarkEnd w:id="1"/>
       <w:r>
         <w:rPr>
           <w:rFonts w:ascii="Times New Roman" w:cs="Times New Roman" w:eastAsia="Times New Roman" w:hAnsi="Times New Roman"/>
@@ -7277,12 +7941,6 @@
       </w:r>
       <w:fldSimple w:instr="REF fig_5_1 \h">
         <w:r>
-          <w:rPr>
-            <w:rFonts w:ascii="Times New Roman" w:cs="Times New Roman" w:eastAsia="Times New Roman" w:hAnsi="Times New Roman"/>
-            <w:color w:val="000000"/>
-            <w:sz w:val="24"/>
-            <w:szCs w:val="24"/>
-          </w:rPr>
           <w:t xml:space="preserve">Figure 5.1</w:t>
         </w:r>
       </w:fldSimple>
@@ -7311,7 +7969,7 @@
         <w:ind w:left="0" w:right="0" w:firstLine="0"/>
         <w:jc w:val="left"/>
       </w:pPr>
-      <w:bookmarkStart w:name="h_19" w:id="124"/>
+      <w:bookmarkStart w:name="h_22" w:id="1"/>
       <w:r>
         <w:rPr>
           <w:rFonts w:ascii="Times New Roman" w:cs="Times New Roman" w:eastAsia="Times New Roman" w:hAnsi="Times New Roman"/>
@@ -7325,7 +7983,7 @@
         </w:rPr>
         <w:t xml:space="preserve">Production Considerations</w:t>
       </w:r>
-      <w:bookmarkEnd w:id="124"/>
+      <w:bookmarkEnd w:id="1"/>
     </w:p>
     <w:p>
       <w:pPr>
@@ -7334,7 +7992,7 @@
         <w:ind w:left="0" w:right="0" w:firstLine="0"/>
         <w:jc w:val="left"/>
       </w:pPr>
-      <w:bookmarkStart w:name="tbl_5_1" w:id="125"/>
+      <w:bookmarkStart w:name="tbl_5_1" w:id="1"/>
       <w:r>
         <w:rPr>
           <w:rFonts w:ascii="Times New Roman" w:cs="Times New Roman" w:eastAsia="Times New Roman" w:hAnsi="Times New Roman"/>
@@ -7348,7 +8006,7 @@
         </w:rPr>
         <w:t xml:space="preserve">Table 5.1</w:t>
       </w:r>
-      <w:bookmarkEnd w:id="125"/>
+      <w:bookmarkEnd w:id="1"/>
       <w:r>
         <w:rPr>
           <w:rFonts w:ascii="Times New Roman" w:cs="Times New Roman" w:eastAsia="Times New Roman" w:hAnsi="Times New Roman"/>
@@ -7360,7 +8018,7 @@
           <w:sz w:val="18"/>
           <w:szCs w:val="18"/>
         </w:rPr>
-        <w:t xml:space="preserve">: Deployment Constraints for Production</w:t>
+        <w:t xml:space="preserve">: Deployment constraints for production</w:t>
       </w:r>
     </w:p>
     <w:tbl>
@@ -7961,7 +8619,7 @@
                 <w:sz w:val="20"/>
                 <w:szCs w:val="20"/>
               </w:rPr>
-              <w:t xml:space="preserve">Encryption terminates at the ingress. Session cookies are marked secure wherever transport encryption is present</w:t>
+              <w:t xml:space="preserve">Encryption terminates at the ingress and session cookies are marked secure. The clinical database URL requires TLS, but the clinical StatefulSet configures no server certificate, so that connection cannot start as written</w:t>
             </w:r>
           </w:p>
         </w:tc>
@@ -8193,7 +8851,7 @@
                 <w:sz w:val="20"/>
                 <w:szCs w:val="20"/>
               </w:rPr>
-              <w:t xml:space="preserve">Kubernetes manifests are provided for k3s. If ICT prefers another arrangement the manifests are discarded and nothing else changes</w:t>
+              <w:t xml:space="preserve">Kubernetes manifests define all six services, web, Keycloak and both database instances. ICT has not approved k3s rather than another arrangement</w:t>
             </w:r>
           </w:p>
         </w:tc>
@@ -8210,7 +8868,7 @@
         <w:ind w:left="0" w:right="0" w:firstLine="0"/>
         <w:jc w:val="left"/>
       </w:pPr>
-      <w:bookmarkStart w:name="h_20" w:id="126"/>
+      <w:bookmarkStart w:name="h_23" w:id="1"/>
       <w:r>
         <w:rPr>
           <w:rFonts w:ascii="Times New Roman" w:cs="Times New Roman" w:eastAsia="Times New Roman" w:hAnsi="Times New Roman"/>
@@ -8224,7 +8882,7 @@
         </w:rPr>
         <w:t xml:space="preserve">Observability</w:t>
       </w:r>
-      <w:bookmarkEnd w:id="126"/>
+      <w:bookmarkEnd w:id="1"/>
     </w:p>
     <w:p>
       <w:pPr>
@@ -8263,7 +8921,27 @@
           <w:sz w:val="24"/>
           <w:szCs w:val="24"/>
         </w:rPr>
-        <w:t xml:space="preserve">No clinical content reaches any log line, metric label or trace. Grafana is for operating the system and is not a second route to divisional data. No dashboard there queries clinical data and none reproduces an indicator.</w:t>
+        <w:t xml:space="preserve">Ordinary request logs and panic recovery also record the chi route template rather than the concrete path. A patient, visit or referral identifier in a concrete URL would otherwise become clinical data in an operational log, where the clinical access controls do not apply. Query strings and bodies are not logged.</w:t>
+      </w:r>
+    </w:p>
+    <w:p>
+      <w:pPr>
+        <w:spacing w:after="160" w:line="276" w:lineRule="auto"/>
+        <w:ind w:left="0" w:right="0" w:firstLine="0"/>
+        <w:jc w:val="both"/>
+      </w:pPr>
+      <w:r>
+        <w:rPr>
+          <w:rFonts w:ascii="Times New Roman" w:cs="Times New Roman" w:eastAsia="Times New Roman" w:hAnsi="Times New Roman"/>
+          <w:b w:val="false"/>
+          <w:bCs w:val="false"/>
+          <w:i w:val="false"/>
+          <w:iCs w:val="false"/>
+          <w:color w:val="000000"/>
+          <w:sz w:val="24"/>
+          <w:szCs w:val="24"/>
+        </w:rPr>
+        <w:t xml:space="preserve">No clinical narrative reaches a log line, metric label or trace. Grafana is for operating the system and is not a second route to divisional data. No dashboard there queries clinical data and none reproduces an indicator.</w:t>
       </w:r>
     </w:p>
     <w:p>
@@ -8277,7 +8955,7 @@
         <w:ind w:left="0" w:right="0" w:firstLine="0"/>
         <w:jc w:val="left"/>
       </w:pPr>
-      <w:bookmarkStart w:name="h_21" w:id="127"/>
+      <w:bookmarkStart w:name="h_24" w:id="1"/>
       <w:r>
         <w:rPr>
           <w:rFonts w:ascii="Times New Roman" w:cs="Times New Roman" w:eastAsia="Times New Roman" w:hAnsi="Times New Roman"/>
@@ -8291,7 +8969,7 @@
         </w:rPr>
         <w:t xml:space="preserve">Maintainability</w:t>
       </w:r>
-      <w:bookmarkEnd w:id="127"/>
+      <w:bookmarkEnd w:id="1"/>
     </w:p>
     <w:p>
       <w:pPr>
@@ -8320,7 +8998,7 @@
         <w:ind w:left="0" w:right="0" w:firstLine="0"/>
         <w:jc w:val="left"/>
       </w:pPr>
-      <w:bookmarkStart w:name="tbl_6_1" w:id="128"/>
+      <w:bookmarkStart w:name="tbl_6_1" w:id="1"/>
       <w:r>
         <w:rPr>
           <w:rFonts w:ascii="Times New Roman" w:cs="Times New Roman" w:eastAsia="Times New Roman" w:hAnsi="Times New Roman"/>
@@ -8334,7 +9012,7 @@
         </w:rPr>
         <w:t xml:space="preserve">Table 6.1</w:t>
       </w:r>
-      <w:bookmarkEnd w:id="128"/>
+      <w:bookmarkEnd w:id="1"/>
       <w:r>
         <w:rPr>
           <w:rFonts w:ascii="Times New Roman" w:cs="Times New Roman" w:eastAsia="Times New Roman" w:hAnsi="Times New Roman"/>
@@ -8346,7 +9024,7 @@
           <w:sz w:val="18"/>
           <w:szCs w:val="18"/>
         </w:rPr>
-        <w:t xml:space="preserve">: Measures That Keep the Topology Maintainable</w:t>
+        <w:t xml:space="preserve">: Measures that keep the topology maintainable</w:t>
       </w:r>
     </w:p>
     <w:tbl>
@@ -9196,7 +9874,7 @@
         <w:ind w:left="0" w:right="0" w:firstLine="0"/>
         <w:jc w:val="left"/>
       </w:pPr>
-      <w:bookmarkStart w:name="h_22" w:id="129"/>
+      <w:bookmarkStart w:name="h_25" w:id="1"/>
       <w:r>
         <w:rPr>
           <w:rFonts w:ascii="Times New Roman" w:cs="Times New Roman" w:eastAsia="Times New Roman" w:hAnsi="Times New Roman"/>
@@ -9208,9 +9886,9 @@
           <w:sz w:val="24"/>
           <w:szCs w:val="24"/>
         </w:rPr>
-        <w:t xml:space="preserve">Known Limitations</w:t>
+        <w:t xml:space="preserve">Known limitations</w:t>
       </w:r>
-      <w:bookmarkEnd w:id="129"/>
+      <w:bookmarkEnd w:id="1"/>
     </w:p>
     <w:p>
       <w:pPr>
@@ -9219,7 +9897,7 @@
         <w:ind w:left="0" w:right="0" w:firstLine="0"/>
         <w:jc w:val="left"/>
       </w:pPr>
-      <w:bookmarkStart w:name="tbl_6_2" w:id="130"/>
+      <w:bookmarkStart w:name="tbl_6_2" w:id="1"/>
       <w:r>
         <w:rPr>
           <w:rFonts w:ascii="Times New Roman" w:cs="Times New Roman" w:eastAsia="Times New Roman" w:hAnsi="Times New Roman"/>
@@ -9233,7 +9911,7 @@
         </w:rPr>
         <w:t xml:space="preserve">Table 6.2</w:t>
       </w:r>
-      <w:bookmarkEnd w:id="130"/>
+      <w:bookmarkEnd w:id="1"/>
       <w:r>
         <w:rPr>
           <w:rFonts w:ascii="Times New Roman" w:cs="Times New Roman" w:eastAsia="Times New Roman" w:hAnsi="Times New Roman"/>
@@ -9245,7 +9923,7 @@
           <w:sz w:val="18"/>
           <w:szCs w:val="18"/>
         </w:rPr>
-        <w:t xml:space="preserve">: Known Limitations and Their Consequences</w:t>
+        <w:t xml:space="preserve">: Known limitations and their consequences</w:t>
       </w:r>
     </w:p>
     <w:tbl>
@@ -10197,6 +10875,622 @@
           </w:p>
         </w:tc>
       </w:tr>
+      <w:tr>
+        <w:tc>
+          <w:tcPr>
+            <w:tcW w:type="dxa" w:w="620"/>
+            <w:tcBorders>
+              <w:top w:val="single" w:color="000000" w:sz="4"/>
+              <w:left w:val="single" w:color="000000" w:sz="4"/>
+              <w:bottom w:val="single" w:color="000000" w:sz="4"/>
+              <w:right w:val="single" w:color="000000" w:sz="4"/>
+            </w:tcBorders>
+            <w:tcMar>
+              <w:top w:type="dxa" w:w="60"/>
+              <w:left w:type="dxa" w:w="90"/>
+              <w:bottom w:type="dxa" w:w="60"/>
+              <w:right w:type="dxa" w:w="90"/>
+            </w:tcMar>
+            <w:vAlign w:val="center"/>
+          </w:tcPr>
+          <w:p>
+            <w:pPr>
+              <w:spacing w:after="0" w:line="240" w:lineRule="auto"/>
+              <w:ind w:left="0" w:right="0" w:firstLine="0"/>
+              <w:jc w:val="left"/>
+            </w:pPr>
+            <w:r>
+              <w:rPr>
+                <w:rFonts w:ascii="Times New Roman" w:cs="Times New Roman" w:eastAsia="Times New Roman" w:hAnsi="Times New Roman"/>
+                <w:b w:val="false"/>
+                <w:bCs w:val="false"/>
+                <w:i w:val="false"/>
+                <w:iCs w:val="false"/>
+                <w:color w:val="000000"/>
+                <w:sz w:val="20"/>
+                <w:szCs w:val="20"/>
+              </w:rPr>
+              <w:t xml:space="preserve">6</w:t>
+            </w:r>
+          </w:p>
+        </w:tc>
+        <w:tc>
+          <w:tcPr>
+            <w:tcW w:type="dxa" w:w="2471"/>
+            <w:tcBorders>
+              <w:top w:val="single" w:color="000000" w:sz="4"/>
+              <w:left w:val="single" w:color="000000" w:sz="4"/>
+              <w:bottom w:val="single" w:color="000000" w:sz="4"/>
+              <w:right w:val="single" w:color="000000" w:sz="4"/>
+            </w:tcBorders>
+            <w:tcMar>
+              <w:top w:type="dxa" w:w="60"/>
+              <w:left w:type="dxa" w:w="90"/>
+              <w:bottom w:type="dxa" w:w="60"/>
+              <w:right w:type="dxa" w:w="90"/>
+            </w:tcMar>
+            <w:vAlign w:val="center"/>
+          </w:tcPr>
+          <w:p>
+            <w:pPr>
+              <w:spacing w:after="0" w:line="240" w:lineRule="auto"/>
+              <w:ind w:left="0" w:right="0" w:firstLine="0"/>
+              <w:jc w:val="left"/>
+            </w:pPr>
+            <w:r>
+              <w:rPr>
+                <w:rFonts w:ascii="Times New Roman" w:cs="Times New Roman" w:eastAsia="Times New Roman" w:hAnsi="Times New Roman"/>
+                <w:b w:val="false"/>
+                <w:bCs w:val="false"/>
+                <w:i w:val="false"/>
+                <w:iCs w:val="false"/>
+                <w:color w:val="000000"/>
+                <w:sz w:val="20"/>
+                <w:szCs w:val="20"/>
+              </w:rPr>
+              <w:t xml:space="preserve">No separate audit service or restrictive access-log grants</w:t>
+            </w:r>
+          </w:p>
+        </w:tc>
+        <w:tc>
+          <w:tcPr>
+            <w:tcW w:type="dxa" w:w="3232"/>
+            <w:tcBorders>
+              <w:top w:val="single" w:color="000000" w:sz="4"/>
+              <w:left w:val="single" w:color="000000" w:sz="4"/>
+              <w:bottom w:val="single" w:color="000000" w:sz="4"/>
+              <w:right w:val="single" w:color="000000" w:sz="4"/>
+            </w:tcBorders>
+            <w:tcMar>
+              <w:top w:type="dxa" w:w="60"/>
+              <w:left w:type="dxa" w:w="90"/>
+              <w:bottom w:type="dxa" w:w="60"/>
+              <w:right w:type="dxa" w:w="90"/>
+            </w:tcMar>
+            <w:vAlign w:val="center"/>
+          </w:tcPr>
+          <w:p>
+            <w:pPr>
+              <w:spacing w:after="0" w:line="240" w:lineRule="auto"/>
+              <w:ind w:left="0" w:right="0" w:firstLine="0"/>
+              <w:jc w:val="left"/>
+            </w:pPr>
+            <w:r>
+              <w:rPr>
+                <w:rFonts w:ascii="Times New Roman" w:cs="Times New Roman" w:eastAsia="Times New Roman" w:hAnsi="Times New Roman"/>
+                <w:b w:val="false"/>
+                <w:bCs w:val="false"/>
+                <w:i w:val="false"/>
+                <w:iCs w:val="false"/>
+                <w:color w:val="000000"/>
+                <w:sz w:val="20"/>
+                <w:szCs w:val="20"/>
+              </w:rPr>
+              <w:t xml:space="preserve">The clinical service role can alter or delete its own access rows</w:t>
+            </w:r>
+          </w:p>
+        </w:tc>
+        <w:tc>
+          <w:tcPr>
+            <w:tcW w:type="dxa" w:w="3422"/>
+            <w:tcBorders>
+              <w:top w:val="single" w:color="000000" w:sz="4"/>
+              <w:left w:val="single" w:color="000000" w:sz="4"/>
+              <w:bottom w:val="single" w:color="000000" w:sz="4"/>
+              <w:right w:val="single" w:color="000000" w:sz="4"/>
+            </w:tcBorders>
+            <w:tcMar>
+              <w:top w:type="dxa" w:w="60"/>
+              <w:left w:type="dxa" w:w="90"/>
+              <w:bottom w:type="dxa" w:w="60"/>
+              <w:right w:type="dxa" w:w="90"/>
+            </w:tcMar>
+            <w:vAlign w:val="center"/>
+          </w:tcPr>
+          <w:p>
+            <w:pPr>
+              <w:spacing w:after="0" w:line="240" w:lineRule="auto"/>
+              <w:ind w:left="0" w:right="0" w:firstLine="0"/>
+              <w:jc w:val="left"/>
+            </w:pPr>
+            <w:r>
+              <w:rPr>
+                <w:rFonts w:ascii="Times New Roman" w:cs="Times New Roman" w:eastAsia="Times New Roman" w:hAnsi="Times New Roman"/>
+                <w:b w:val="false"/>
+                <w:bCs w:val="false"/>
+                <w:i w:val="false"/>
+                <w:iCs w:val="false"/>
+                <w:color w:val="000000"/>
+                <w:sz w:val="20"/>
+                <w:szCs w:val="20"/>
+              </w:rPr>
+              <w:t xml:space="preserve">Build hwms-audit and enforce insert-only grants</w:t>
+            </w:r>
+          </w:p>
+        </w:tc>
+      </w:tr>
+      <w:tr>
+        <w:tc>
+          <w:tcPr>
+            <w:tcW w:type="dxa" w:w="620"/>
+            <w:tcBorders>
+              <w:top w:val="single" w:color="000000" w:sz="4"/>
+              <w:left w:val="single" w:color="000000" w:sz="4"/>
+              <w:bottom w:val="single" w:color="000000" w:sz="4"/>
+              <w:right w:val="single" w:color="000000" w:sz="4"/>
+            </w:tcBorders>
+            <w:tcMar>
+              <w:top w:type="dxa" w:w="60"/>
+              <w:left w:type="dxa" w:w="90"/>
+              <w:bottom w:type="dxa" w:w="60"/>
+              <w:right w:type="dxa" w:w="90"/>
+            </w:tcMar>
+            <w:vAlign w:val="center"/>
+          </w:tcPr>
+          <w:p>
+            <w:pPr>
+              <w:spacing w:after="0" w:line="240" w:lineRule="auto"/>
+              <w:ind w:left="0" w:right="0" w:firstLine="0"/>
+              <w:jc w:val="left"/>
+            </w:pPr>
+            <w:r>
+              <w:rPr>
+                <w:rFonts w:ascii="Times New Roman" w:cs="Times New Roman" w:eastAsia="Times New Roman" w:hAnsi="Times New Roman"/>
+                <w:b w:val="false"/>
+                <w:bCs w:val="false"/>
+                <w:i w:val="false"/>
+                <w:iCs w:val="false"/>
+                <w:color w:val="000000"/>
+                <w:sz w:val="20"/>
+                <w:szCs w:val="20"/>
+              </w:rPr>
+              <w:t xml:space="preserve">7</w:t>
+            </w:r>
+          </w:p>
+        </w:tc>
+        <w:tc>
+          <w:tcPr>
+            <w:tcW w:type="dxa" w:w="2471"/>
+            <w:tcBorders>
+              <w:top w:val="single" w:color="000000" w:sz="4"/>
+              <w:left w:val="single" w:color="000000" w:sz="4"/>
+              <w:bottom w:val="single" w:color="000000" w:sz="4"/>
+              <w:right w:val="single" w:color="000000" w:sz="4"/>
+            </w:tcBorders>
+            <w:tcMar>
+              <w:top w:type="dxa" w:w="60"/>
+              <w:left w:type="dxa" w:w="90"/>
+              <w:bottom w:type="dxa" w:w="60"/>
+              <w:right w:type="dxa" w:w="90"/>
+            </w:tcMar>
+            <w:vAlign w:val="center"/>
+          </w:tcPr>
+          <w:p>
+            <w:pPr>
+              <w:spacing w:after="0" w:line="240" w:lineRule="auto"/>
+              <w:ind w:left="0" w:right="0" w:firstLine="0"/>
+              <w:jc w:val="left"/>
+            </w:pPr>
+            <w:r>
+              <w:rPr>
+                <w:rFonts w:ascii="Times New Roman" w:cs="Times New Roman" w:eastAsia="Times New Roman" w:hAnsi="Times New Roman"/>
+                <w:b w:val="false"/>
+                <w:bCs w:val="false"/>
+                <w:i w:val="false"/>
+                <w:iCs w:val="false"/>
+                <w:color w:val="000000"/>
+                <w:sz w:val="20"/>
+                <w:szCs w:val="20"/>
+              </w:rPr>
+              <w:t xml:space="preserve">Clinical to metrics authentication uses a shared secret</w:t>
+            </w:r>
+          </w:p>
+        </w:tc>
+        <w:tc>
+          <w:tcPr>
+            <w:tcW w:type="dxa" w:w="3232"/>
+            <w:tcBorders>
+              <w:top w:val="single" w:color="000000" w:sz="4"/>
+              <w:left w:val="single" w:color="000000" w:sz="4"/>
+              <w:bottom w:val="single" w:color="000000" w:sz="4"/>
+              <w:right w:val="single" w:color="000000" w:sz="4"/>
+            </w:tcBorders>
+            <w:tcMar>
+              <w:top w:type="dxa" w:w="60"/>
+              <w:left w:type="dxa" w:w="90"/>
+              <w:bottom w:type="dxa" w:w="60"/>
+              <w:right w:type="dxa" w:w="90"/>
+            </w:tcMar>
+            <w:vAlign w:val="center"/>
+          </w:tcPr>
+          <w:p>
+            <w:pPr>
+              <w:spacing w:after="0" w:line="240" w:lineRule="auto"/>
+              <w:ind w:left="0" w:right="0" w:firstLine="0"/>
+              <w:jc w:val="left"/>
+            </w:pPr>
+            <w:r>
+              <w:rPr>
+                <w:rFonts w:ascii="Times New Roman" w:cs="Times New Roman" w:eastAsia="Times New Roman" w:hAnsi="Times New Roman"/>
+                <w:b w:val="false"/>
+                <w:bCs w:val="false"/>
+                <w:i w:val="false"/>
+                <w:iCs w:val="false"/>
+                <w:color w:val="000000"/>
+                <w:sz w:val="20"/>
+                <w:szCs w:val="20"/>
+              </w:rPr>
+              <w:t xml:space="preserve">The internal caller has no scoped service identity</w:t>
+            </w:r>
+          </w:p>
+        </w:tc>
+        <w:tc>
+          <w:tcPr>
+            <w:tcW w:type="dxa" w:w="3422"/>
+            <w:tcBorders>
+              <w:top w:val="single" w:color="000000" w:sz="4"/>
+              <w:left w:val="single" w:color="000000" w:sz="4"/>
+              <w:bottom w:val="single" w:color="000000" w:sz="4"/>
+              <w:right w:val="single" w:color="000000" w:sz="4"/>
+            </w:tcBorders>
+            <w:tcMar>
+              <w:top w:type="dxa" w:w="60"/>
+              <w:left w:type="dxa" w:w="90"/>
+              <w:bottom w:type="dxa" w:w="60"/>
+              <w:right w:type="dxa" w:w="90"/>
+            </w:tcMar>
+            <w:vAlign w:val="center"/>
+          </w:tcPr>
+          <w:p>
+            <w:pPr>
+              <w:spacing w:after="0" w:line="240" w:lineRule="auto"/>
+              <w:ind w:left="0" w:right="0" w:firstLine="0"/>
+              <w:jc w:val="left"/>
+            </w:pPr>
+            <w:r>
+              <w:rPr>
+                <w:rFonts w:ascii="Times New Roman" w:cs="Times New Roman" w:eastAsia="Times New Roman" w:hAnsi="Times New Roman"/>
+                <w:b w:val="false"/>
+                <w:bCs w:val="false"/>
+                <w:i w:val="false"/>
+                <w:iCs w:val="false"/>
+                <w:color w:val="000000"/>
+                <w:sz w:val="20"/>
+                <w:szCs w:val="20"/>
+              </w:rPr>
+              <w:t xml:space="preserve">Replace it with a Keycloak service account before production</w:t>
+            </w:r>
+          </w:p>
+        </w:tc>
+      </w:tr>
+      <w:tr>
+        <w:tc>
+          <w:tcPr>
+            <w:tcW w:type="dxa" w:w="620"/>
+            <w:tcBorders>
+              <w:top w:val="single" w:color="000000" w:sz="4"/>
+              <w:left w:val="single" w:color="000000" w:sz="4"/>
+              <w:bottom w:val="single" w:color="000000" w:sz="4"/>
+              <w:right w:val="single" w:color="000000" w:sz="4"/>
+            </w:tcBorders>
+            <w:tcMar>
+              <w:top w:type="dxa" w:w="60"/>
+              <w:left w:type="dxa" w:w="90"/>
+              <w:bottom w:type="dxa" w:w="60"/>
+              <w:right w:type="dxa" w:w="90"/>
+            </w:tcMar>
+            <w:vAlign w:val="center"/>
+          </w:tcPr>
+          <w:p>
+            <w:pPr>
+              <w:spacing w:after="0" w:line="240" w:lineRule="auto"/>
+              <w:ind w:left="0" w:right="0" w:firstLine="0"/>
+              <w:jc w:val="left"/>
+            </w:pPr>
+            <w:r>
+              <w:rPr>
+                <w:rFonts w:ascii="Times New Roman" w:cs="Times New Roman" w:eastAsia="Times New Roman" w:hAnsi="Times New Roman"/>
+                <w:b w:val="false"/>
+                <w:bCs w:val="false"/>
+                <w:i w:val="false"/>
+                <w:iCs w:val="false"/>
+                <w:color w:val="000000"/>
+                <w:sz w:val="20"/>
+                <w:szCs w:val="20"/>
+              </w:rPr>
+              <w:t xml:space="preserve">8</w:t>
+            </w:r>
+          </w:p>
+        </w:tc>
+        <w:tc>
+          <w:tcPr>
+            <w:tcW w:type="dxa" w:w="2471"/>
+            <w:tcBorders>
+              <w:top w:val="single" w:color="000000" w:sz="4"/>
+              <w:left w:val="single" w:color="000000" w:sz="4"/>
+              <w:bottom w:val="single" w:color="000000" w:sz="4"/>
+              <w:right w:val="single" w:color="000000" w:sz="4"/>
+            </w:tcBorders>
+            <w:tcMar>
+              <w:top w:type="dxa" w:w="60"/>
+              <w:left w:type="dxa" w:w="90"/>
+              <w:bottom w:type="dxa" w:w="60"/>
+              <w:right w:type="dxa" w:w="90"/>
+            </w:tcMar>
+            <w:vAlign w:val="center"/>
+          </w:tcPr>
+          <w:p>
+            <w:pPr>
+              <w:spacing w:after="0" w:line="240" w:lineRule="auto"/>
+              <w:ind w:left="0" w:right="0" w:firstLine="0"/>
+              <w:jc w:val="left"/>
+            </w:pPr>
+            <w:r>
+              <w:rPr>
+                <w:rFonts w:ascii="Times New Roman" w:cs="Times New Roman" w:eastAsia="Times New Roman" w:hAnsi="Times New Roman"/>
+                <w:b w:val="false"/>
+                <w:bCs w:val="false"/>
+                <w:i w:val="false"/>
+                <w:iCs w:val="false"/>
+                <w:color w:val="000000"/>
+                <w:sz w:val="20"/>
+                <w:szCs w:val="20"/>
+              </w:rPr>
+              <w:t xml:space="preserve">Patient history export is generated in the browser</w:t>
+            </w:r>
+          </w:p>
+        </w:tc>
+        <w:tc>
+          <w:tcPr>
+            <w:tcW w:type="dxa" w:w="3232"/>
+            <w:tcBorders>
+              <w:top w:val="single" w:color="000000" w:sz="4"/>
+              <w:left w:val="single" w:color="000000" w:sz="4"/>
+              <w:bottom w:val="single" w:color="000000" w:sz="4"/>
+              <w:right w:val="single" w:color="000000" w:sz="4"/>
+            </w:tcBorders>
+            <w:tcMar>
+              <w:top w:type="dxa" w:w="60"/>
+              <w:left w:type="dxa" w:w="90"/>
+              <w:bottom w:type="dxa" w:w="60"/>
+              <w:right w:type="dxa" w:w="90"/>
+            </w:tcMar>
+            <w:vAlign w:val="center"/>
+          </w:tcPr>
+          <w:p>
+            <w:pPr>
+              <w:spacing w:after="0" w:line="240" w:lineRule="auto"/>
+              <w:ind w:left="0" w:right="0" w:firstLine="0"/>
+              <w:jc w:val="left"/>
+            </w:pPr>
+            <w:r>
+              <w:rPr>
+                <w:rFonts w:ascii="Times New Roman" w:cs="Times New Roman" w:eastAsia="Times New Roman" w:hAnsi="Times New Roman"/>
+                <w:b w:val="false"/>
+                <w:bCs w:val="false"/>
+                <w:i w:val="false"/>
+                <w:iCs w:val="false"/>
+                <w:color w:val="000000"/>
+                <w:sz w:val="20"/>
+                <w:szCs w:val="20"/>
+              </w:rPr>
+              <w:t xml:space="preserve">The download has no distinct audit event or versioned server template</w:t>
+            </w:r>
+          </w:p>
+        </w:tc>
+        <w:tc>
+          <w:tcPr>
+            <w:tcW w:type="dxa" w:w="3422"/>
+            <w:tcBorders>
+              <w:top w:val="single" w:color="000000" w:sz="4"/>
+              <w:left w:val="single" w:color="000000" w:sz="4"/>
+              <w:bottom w:val="single" w:color="000000" w:sz="4"/>
+              <w:right w:val="single" w:color="000000" w:sz="4"/>
+            </w:tcBorders>
+            <w:tcMar>
+              <w:top w:type="dxa" w:w="60"/>
+              <w:left w:type="dxa" w:w="90"/>
+              <w:bottom w:type="dxa" w:w="60"/>
+              <w:right w:type="dxa" w:w="90"/>
+            </w:tcMar>
+            <w:vAlign w:val="center"/>
+          </w:tcPr>
+          <w:p>
+            <w:pPr>
+              <w:spacing w:after="0" w:line="240" w:lineRule="auto"/>
+              <w:ind w:left="0" w:right="0" w:firstLine="0"/>
+              <w:jc w:val="left"/>
+            </w:pPr>
+            <w:r>
+              <w:rPr>
+                <w:rFonts w:ascii="Times New Roman" w:cs="Times New Roman" w:eastAsia="Times New Roman" w:hAnsi="Times New Roman"/>
+                <w:b w:val="false"/>
+                <w:bCs w:val="false"/>
+                <w:i w:val="false"/>
+                <w:iCs w:val="false"/>
+                <w:color w:val="000000"/>
+                <w:sz w:val="20"/>
+                <w:szCs w:val="20"/>
+              </w:rPr>
+              <w:t xml:space="preserve">Resolve DEC-037 and move controlled generation server side if archival reproduction remains required</w:t>
+            </w:r>
+          </w:p>
+        </w:tc>
+      </w:tr>
+      <w:tr>
+        <w:tc>
+          <w:tcPr>
+            <w:tcW w:type="dxa" w:w="620"/>
+            <w:tcBorders>
+              <w:top w:val="single" w:color="000000" w:sz="4"/>
+              <w:left w:val="single" w:color="000000" w:sz="4"/>
+              <w:bottom w:val="single" w:color="000000" w:sz="4"/>
+              <w:right w:val="single" w:color="000000" w:sz="4"/>
+            </w:tcBorders>
+            <w:tcMar>
+              <w:top w:type="dxa" w:w="60"/>
+              <w:left w:type="dxa" w:w="90"/>
+              <w:bottom w:type="dxa" w:w="60"/>
+              <w:right w:type="dxa" w:w="90"/>
+            </w:tcMar>
+            <w:vAlign w:val="center"/>
+          </w:tcPr>
+          <w:p>
+            <w:pPr>
+              <w:spacing w:after="0" w:line="240" w:lineRule="auto"/>
+              <w:ind w:left="0" w:right="0" w:firstLine="0"/>
+              <w:jc w:val="left"/>
+            </w:pPr>
+            <w:r>
+              <w:rPr>
+                <w:rFonts w:ascii="Times New Roman" w:cs="Times New Roman" w:eastAsia="Times New Roman" w:hAnsi="Times New Roman"/>
+                <w:b w:val="false"/>
+                <w:bCs w:val="false"/>
+                <w:i w:val="false"/>
+                <w:iCs w:val="false"/>
+                <w:color w:val="000000"/>
+                <w:sz w:val="20"/>
+                <w:szCs w:val="20"/>
+              </w:rPr>
+              <w:t xml:space="preserve">9</w:t>
+            </w:r>
+          </w:p>
+        </w:tc>
+        <w:tc>
+          <w:tcPr>
+            <w:tcW w:type="dxa" w:w="2471"/>
+            <w:tcBorders>
+              <w:top w:val="single" w:color="000000" w:sz="4"/>
+              <w:left w:val="single" w:color="000000" w:sz="4"/>
+              <w:bottom w:val="single" w:color="000000" w:sz="4"/>
+              <w:right w:val="single" w:color="000000" w:sz="4"/>
+            </w:tcBorders>
+            <w:tcMar>
+              <w:top w:type="dxa" w:w="60"/>
+              <w:left w:type="dxa" w:w="90"/>
+              <w:bottom w:type="dxa" w:w="60"/>
+              <w:right w:type="dxa" w:w="90"/>
+            </w:tcMar>
+            <w:vAlign w:val="center"/>
+          </w:tcPr>
+          <w:p>
+            <w:pPr>
+              <w:spacing w:after="0" w:line="240" w:lineRule="auto"/>
+              <w:ind w:left="0" w:right="0" w:firstLine="0"/>
+              <w:jc w:val="left"/>
+            </w:pPr>
+            <w:r>
+              <w:rPr>
+                <w:rFonts w:ascii="Times New Roman" w:cs="Times New Roman" w:eastAsia="Times New Roman" w:hAnsi="Times New Roman"/>
+                <w:b w:val="false"/>
+                <w:bCs w:val="false"/>
+                <w:i w:val="false"/>
+                <w:iCs w:val="false"/>
+                <w:color w:val="000000"/>
+                <w:sz w:val="20"/>
+                <w:szCs w:val="20"/>
+              </w:rPr>
+              <w:t xml:space="preserve">Clinical database TLS is incomplete in k3s</w:t>
+            </w:r>
+          </w:p>
+        </w:tc>
+        <w:tc>
+          <w:tcPr>
+            <w:tcW w:type="dxa" w:w="3232"/>
+            <w:tcBorders>
+              <w:top w:val="single" w:color="000000" w:sz="4"/>
+              <w:left w:val="single" w:color="000000" w:sz="4"/>
+              <w:bottom w:val="single" w:color="000000" w:sz="4"/>
+              <w:right w:val="single" w:color="000000" w:sz="4"/>
+            </w:tcBorders>
+            <w:tcMar>
+              <w:top w:type="dxa" w:w="60"/>
+              <w:left w:type="dxa" w:w="90"/>
+              <w:bottom w:type="dxa" w:w="60"/>
+              <w:right w:type="dxa" w:w="90"/>
+            </w:tcMar>
+            <w:vAlign w:val="center"/>
+          </w:tcPr>
+          <w:p>
+            <w:pPr>
+              <w:spacing w:after="0" w:line="240" w:lineRule="auto"/>
+              <w:ind w:left="0" w:right="0" w:firstLine="0"/>
+              <w:jc w:val="left"/>
+            </w:pPr>
+            <w:r>
+              <w:rPr>
+                <w:rFonts w:ascii="Times New Roman" w:cs="Times New Roman" w:eastAsia="Times New Roman" w:hAnsi="Times New Roman"/>
+                <w:b w:val="false"/>
+                <w:bCs w:val="false"/>
+                <w:i w:val="false"/>
+                <w:iCs w:val="false"/>
+                <w:color w:val="000000"/>
+                <w:sz w:val="20"/>
+                <w:szCs w:val="20"/>
+              </w:rPr>
+              <w:t xml:space="preserve">The connection URL requires TLS but the StatefulSet supplies no server certificate</w:t>
+            </w:r>
+          </w:p>
+        </w:tc>
+        <w:tc>
+          <w:tcPr>
+            <w:tcW w:type="dxa" w:w="3422"/>
+            <w:tcBorders>
+              <w:top w:val="single" w:color="000000" w:sz="4"/>
+              <w:left w:val="single" w:color="000000" w:sz="4"/>
+              <w:bottom w:val="single" w:color="000000" w:sz="4"/>
+              <w:right w:val="single" w:color="000000" w:sz="4"/>
+            </w:tcBorders>
+            <w:tcMar>
+              <w:top w:type="dxa" w:w="60"/>
+              <w:left w:type="dxa" w:w="90"/>
+              <w:bottom w:type="dxa" w:w="60"/>
+              <w:right w:type="dxa" w:w="90"/>
+            </w:tcMar>
+            <w:vAlign w:val="center"/>
+          </w:tcPr>
+          <w:p>
+            <w:pPr>
+              <w:spacing w:after="0" w:line="240" w:lineRule="auto"/>
+              <w:ind w:left="0" w:right="0" w:firstLine="0"/>
+              <w:jc w:val="left"/>
+            </w:pPr>
+            <w:r>
+              <w:rPr>
+                <w:rFonts w:ascii="Times New Roman" w:cs="Times New Roman" w:eastAsia="Times New Roman" w:hAnsi="Times New Roman"/>
+                <w:b w:val="false"/>
+                <w:bCs w:val="false"/>
+                <w:i w:val="false"/>
+                <w:iCs w:val="false"/>
+                <w:color w:val="000000"/>
+                <w:sz w:val="20"/>
+                <w:szCs w:val="20"/>
+              </w:rPr>
+              <w:t xml:space="preserve">ICT supplies certificates and server configuration, or approves a different written connection policy</w:t>
+            </w:r>
+          </w:p>
+        </w:tc>
+      </w:tr>
     </w:tbl>
     <w:p>
       <w:pPr>
@@ -10209,7 +11503,7 @@
         <w:ind w:left="0" w:right="0" w:firstLine="0"/>
         <w:jc w:val="left"/>
       </w:pPr>
-      <w:bookmarkStart w:name="h_23" w:id="131"/>
+      <w:bookmarkStart w:name="h_26" w:id="1"/>
       <w:r>
         <w:rPr>
           <w:rFonts w:ascii="Times New Roman" w:cs="Times New Roman" w:eastAsia="Times New Roman" w:hAnsi="Times New Roman"/>
@@ -10223,7 +11517,7 @@
         </w:rPr>
         <w:t xml:space="preserve">Handover</w:t>
       </w:r>
-      <w:bookmarkEnd w:id="131"/>
+      <w:bookmarkEnd w:id="1"/>
     </w:p>
     <w:p>
       <w:pPr>
@@ -10252,7 +11546,7 @@
         <w:ind w:left="0" w:right="0" w:firstLine="0"/>
         <w:jc w:val="left"/>
       </w:pPr>
-      <w:bookmarkStart w:name="tbl_7_1" w:id="132"/>
+      <w:bookmarkStart w:name="tbl_7_1" w:id="1"/>
       <w:r>
         <w:rPr>
           <w:rFonts w:ascii="Times New Roman" w:cs="Times New Roman" w:eastAsia="Times New Roman" w:hAnsi="Times New Roman"/>
@@ -10266,7 +11560,7 @@
         </w:rPr>
         <w:t xml:space="preserve">Table 7.1</w:t>
       </w:r>
-      <w:bookmarkEnd w:id="132"/>
+      <w:bookmarkEnd w:id="1"/>
       <w:r>
         <w:rPr>
           <w:rFonts w:ascii="Times New Roman" w:cs="Times New Roman" w:eastAsia="Times New Roman" w:hAnsi="Times New Roman"/>
@@ -10278,7 +11572,7 @@
           <w:sz w:val="18"/>
           <w:szCs w:val="18"/>
         </w:rPr>
-        <w:t xml:space="preserve">: Position at Handover</w:t>
+        <w:t xml:space="preserve">: Position at handover</w:t>
       </w:r>
     </w:p>
     <w:tbl>
@@ -10531,7 +11825,7 @@
                 <w:sz w:val="20"/>
                 <w:szCs w:val="20"/>
               </w:rPr>
-              <w:t xml:space="preserve">Sign in, roles, account administration, patient registry, clinic visits with section state and signing, laboratory requisitions with results and a printable form, and the consolidated patient record</w:t>
+              <w:t xml:space="preserve">KMC sign-in theme, roles, account administration, clinical records and forms, referrals, ergonomics, industrial hygiene, monthly returns with corrections, effective-dated reference APIs and the nine-indicator dashboard</w:t>
             </w:r>
           </w:p>
         </w:tc>
@@ -10647,7 +11941,7 @@
                 <w:sz w:val="20"/>
                 <w:szCs w:val="20"/>
               </w:rPr>
-              <w:t xml:space="preserve">Referrals, ergonomics, industrial hygiene, monthly returns and indicator computation</w:t>
+              <w:t xml:space="preserve">Signed visit amendments, the separate audit deployable, controlled server-side document templates, report archive, log aggregation and continuous integration</w:t>
             </w:r>
           </w:p>
         </w:tc>
@@ -10763,7 +12057,7 @@
                 <w:sz w:val="20"/>
                 <w:szCs w:val="20"/>
               </w:rPr>
-              <w:t xml:space="preserve">Settle the decisions listed in the requirements specification, in particular referral authorisation and record retention</w:t>
+              <w:t xml:space="preserve">Resolve the production blockers in the stakeholder register, then close audit isolation, export auditing and the clinical database TLS mismatch</w:t>
             </w:r>
           </w:p>
         </w:tc>
@@ -11139,7 +12433,7 @@
         <w:ind w:left="0" w:right="0" w:firstLine="0"/>
         <w:jc w:val="left"/>
       </w:pPr>
-      <w:bookmarkStart w:name="tbl_7_2" w:id="133"/>
+      <w:bookmarkStart w:name="tbl_7_2" w:id="1"/>
       <w:r>
         <w:rPr>
           <w:rFonts w:ascii="Times New Roman" w:cs="Times New Roman" w:eastAsia="Times New Roman" w:hAnsi="Times New Roman"/>
@@ -11153,7 +12447,7 @@
         </w:rPr>
         <w:t xml:space="preserve">Table 7.2</w:t>
       </w:r>
-      <w:bookmarkEnd w:id="133"/>
+      <w:bookmarkEnd w:id="1"/>
       <w:r>
         <w:rPr>
           <w:rFonts w:ascii="Times New Roman" w:cs="Times New Roman" w:eastAsia="Times New Roman" w:hAnsi="Times New Roman"/>
@@ -11165,7 +12459,7 @@
           <w:sz w:val="18"/>
           <w:szCs w:val="18"/>
         </w:rPr>
-        <w:t xml:space="preserve">: Architecture Document Sign Off</w:t>
+        <w:t xml:space="preserve">: Architecture document sign-off</w:t>
       </w:r>
     </w:p>
     <w:tbl>

</xml_diff>